<commit_message>
Daily Production Sheet: remove Tomorrow's Team Plan page, fix NAME row background
- Removed Page 2 (Tomorrow's Team Plan / roster) — not required
- Renumbered remaining pages: Priorities → Page 2, Supervisor Register → Page 3
- Fixed NAME / Leave row: dark navy shading changed to light grey so supervisors can write in the field
- Updated carry-rule text and page cross-references accordingly
</commit_message>
<xml_diff>
--- a/Daily-Production-Sheet.docx
+++ b/Daily-Production-Sheet.docx
@@ -4120,7 +4120,7 @@
                 <w:sz w:val="40"/>
                 <w:szCs w:val="40"/>
               </w:rPr>
-              <w:t xml:space="preserve">Tomorrow's Team Plan</w:t>
+              <w:t xml:space="preserve">Tomorrow's Priorities</w:t>
             </w:r>
           </w:p>
           <w:p>
@@ -4134,14 +4134,14 @@
                 <w:sz w:val="17"/>
                 <w:szCs w:val="17"/>
               </w:rPr>
-              <w:t xml:space="preserve">Complete at end of today  ·  Ready for tomorrow's start</w:t>
+              <w:t xml:space="preserve">Complete at end of today  ·  Execute tomorrow</w:t>
             </w:r>
           </w:p>
         </w:tc>
         <w:tc>
           <w:tcPr>
             <w:tcW w:type="dxa" w:w="2800"/>
-            <w:shd w:fill="2E74B5" w:color="auto" w:val="clear"/>
+            <w:shd w:fill="4B2D8B" w:color="auto" w:val="clear"/>
             <w:tcMar>
               <w:top w:type="dxa" w:w="100"/>
               <w:left w:type="dxa" w:w="160"/>
@@ -4178,7 +4178,7 @@
                 <w:sz w:val="14"/>
                 <w:szCs w:val="14"/>
               </w:rPr>
-              <w:t xml:space="preserve">Team &amp; Roster</w:t>
+              <w:t xml:space="preserve">Plan to Succeed</w:t>
             </w:r>
           </w:p>
         </w:tc>
@@ -5067,3863 +5067,6 @@
     </w:tbl>
     <w:p>
       <w:pPr>
-        <w:spacing w:after="200" w:before="0"/>
-      </w:pPr>
-    </w:p>
-    <w:tbl>
-      <w:tblPr>
-        <w:tblW w:type="dxa" w:w="10626"/>
-        <w:tblBorders>
-          <w:top w:val="none" w:color="auto" w:sz="0"/>
-          <w:left w:val="none" w:color="auto" w:sz="0"/>
-          <w:bottom w:val="none" w:color="auto" w:sz="0"/>
-          <w:right w:val="none" w:color="auto" w:sz="0"/>
-          <w:insideH w:val="single" w:color="auto" w:sz="4"/>
-          <w:insideV w:val="single" w:color="auto" w:sz="4"/>
-        </w:tblBorders>
-      </w:tblPr>
-      <w:tblGrid>
-        <w:gridCol w:w="10626"/>
-      </w:tblGrid>
-      <w:tr>
-        <w:tc>
-          <w:tcPr>
-            <w:tcW w:type="dxa" w:w="10626"/>
-            <w:shd w:fill="1F3964" w:color="auto" w:val="clear"/>
-            <w:tcMar>
-              <w:top w:type="dxa" w:w="60"/>
-              <w:left w:type="dxa" w:w="160"/>
-              <w:bottom w:type="dxa" w:w="60"/>
-              <w:right w:type="dxa" w:w="160"/>
-            </w:tcMar>
-          </w:tcPr>
-          <w:p>
-            <w:r>
-              <w:rPr>
-                <w:rFonts w:ascii="Calibri" w:cs="Calibri" w:eastAsia="Calibri" w:hAnsi="Calibri"/>
-                <w:b/>
-                <w:bCs/>
-                <w:color w:val="FFFFFF"/>
-                <w:sz w:val="20"/>
-                <w:szCs w:val="20"/>
-              </w:rPr>
-              <w:t xml:space="preserve">A  —  TEAM ROSTER  (assign every person before you leave)</w:t>
-            </w:r>
-          </w:p>
-        </w:tc>
-      </w:tr>
-    </w:tbl>
-    <w:p>
-      <w:pPr>
-        <w:spacing w:after="120" w:before="0"/>
-      </w:pPr>
-    </w:p>
-    <w:tbl>
-      <w:tblPr>
-        <w:tblW w:type="dxa" w:w="10626"/>
-        <w:tblBorders>
-          <w:top w:val="single" w:color="auto" w:sz="4"/>
-          <w:left w:val="single" w:color="auto" w:sz="4"/>
-          <w:bottom w:val="single" w:color="auto" w:sz="4"/>
-          <w:right w:val="single" w:color="auto" w:sz="4"/>
-          <w:insideH w:val="single" w:color="auto" w:sz="4"/>
-          <w:insideV w:val="single" w:color="auto" w:sz="4"/>
-        </w:tblBorders>
-      </w:tblPr>
-      <w:tblGrid>
-        <w:gridCol w:w="3200"/>
-        <w:gridCol w:w="2000"/>
-        <w:gridCol w:w="3400"/>
-        <w:gridCol w:w="2026"/>
-      </w:tblGrid>
-      <w:tr>
-        <w:tc>
-          <w:tcPr>
-            <w:tcW w:type="dxa" w:w="3200"/>
-            <w:tcBorders>
-              <w:top w:val="single" w:color="1F3964" w:sz="4"/>
-              <w:left w:val="single" w:color="1F3964" w:sz="4"/>
-              <w:bottom w:val="single" w:color="1F3964" w:sz="4"/>
-              <w:right w:val="single" w:color="1F3964" w:sz="4"/>
-            </w:tcBorders>
-            <w:shd w:fill="1F3964" w:color="auto" w:val="clear"/>
-            <w:tcMar>
-              <w:top w:type="dxa" w:w="70"/>
-              <w:left w:type="dxa" w:w="120"/>
-              <w:bottom w:type="dxa" w:w="70"/>
-              <w:right w:type="dxa" w:w="60"/>
-            </w:tcMar>
-          </w:tcPr>
-          <w:p>
-            <w:r>
-              <w:rPr>
-                <w:rFonts w:ascii="Calibri" w:cs="Calibri" w:eastAsia="Calibri" w:hAnsi="Calibri"/>
-                <w:b/>
-                <w:bCs/>
-                <w:color w:val="FFFFFF"/>
-                <w:sz w:val="18"/>
-                <w:szCs w:val="18"/>
-              </w:rPr>
-              <w:t xml:space="preserve">Name</w:t>
-            </w:r>
-          </w:p>
-        </w:tc>
-        <w:tc>
-          <w:tcPr>
-            <w:tcW w:type="dxa" w:w="2000"/>
-            <w:tcBorders>
-              <w:top w:val="single" w:color="1F3964" w:sz="4"/>
-              <w:left w:val="single" w:color="1F3964" w:sz="4"/>
-              <w:bottom w:val="single" w:color="1F3964" w:sz="4"/>
-              <w:right w:val="single" w:color="1F3964" w:sz="4"/>
-            </w:tcBorders>
-            <w:shd w:fill="1F3964" w:color="auto" w:val="clear"/>
-            <w:tcMar>
-              <w:top w:type="dxa" w:w="70"/>
-              <w:left w:type="dxa" w:w="120"/>
-              <w:bottom w:type="dxa" w:w="70"/>
-              <w:right w:type="dxa" w:w="60"/>
-            </w:tcMar>
-          </w:tcPr>
-          <w:p>
-            <w:r>
-              <w:rPr>
-                <w:rFonts w:ascii="Calibri" w:cs="Calibri" w:eastAsia="Calibri" w:hAnsi="Calibri"/>
-                <w:b/>
-                <w:bCs/>
-                <w:color w:val="FFFFFF"/>
-                <w:sz w:val="18"/>
-                <w:szCs w:val="18"/>
-              </w:rPr>
-              <w:t xml:space="preserve">Trade / Role</w:t>
-            </w:r>
-          </w:p>
-        </w:tc>
-        <w:tc>
-          <w:tcPr>
-            <w:tcW w:type="dxa" w:w="3400"/>
-            <w:tcBorders>
-              <w:top w:val="single" w:color="1F3964" w:sz="4"/>
-              <w:left w:val="single" w:color="1F3964" w:sz="4"/>
-              <w:bottom w:val="single" w:color="1F3964" w:sz="4"/>
-              <w:right w:val="single" w:color="1F3964" w:sz="4"/>
-            </w:tcBorders>
-            <w:shd w:fill="1F3964" w:color="auto" w:val="clear"/>
-            <w:tcMar>
-              <w:top w:type="dxa" w:w="70"/>
-              <w:left w:type="dxa" w:w="120"/>
-              <w:bottom w:type="dxa" w:w="70"/>
-              <w:right w:type="dxa" w:w="60"/>
-            </w:tcMar>
-          </w:tcPr>
-          <w:p>
-            <w:r>
-              <w:rPr>
-                <w:rFonts w:ascii="Calibri" w:cs="Calibri" w:eastAsia="Calibri" w:hAnsi="Calibri"/>
-                <w:b/>
-                <w:bCs/>
-                <w:color w:val="FFFFFF"/>
-                <w:sz w:val="18"/>
-                <w:szCs w:val="18"/>
-              </w:rPr>
-              <w:t xml:space="preserve">Assigned Job(s) for Tomorrow</w:t>
-            </w:r>
-          </w:p>
-        </w:tc>
-        <w:tc>
-          <w:tcPr>
-            <w:tcW w:type="dxa" w:w="2026"/>
-            <w:tcBorders>
-              <w:top w:val="single" w:color="1F3964" w:sz="4"/>
-              <w:left w:val="single" w:color="1F3964" w:sz="4"/>
-              <w:bottom w:val="single" w:color="1F3964" w:sz="4"/>
-              <w:right w:val="single" w:color="1F3964" w:sz="4"/>
-            </w:tcBorders>
-            <w:shd w:fill="1F3964" w:color="auto" w:val="clear"/>
-            <w:tcMar>
-              <w:top w:type="dxa" w:w="70"/>
-              <w:left w:type="dxa" w:w="120"/>
-              <w:bottom w:type="dxa" w:w="70"/>
-              <w:right w:type="dxa" w:w="60"/>
-            </w:tcMar>
-          </w:tcPr>
-          <w:p>
-            <w:r>
-              <w:rPr>
-                <w:rFonts w:ascii="Calibri" w:cs="Calibri" w:eastAsia="Calibri" w:hAnsi="Calibri"/>
-                <w:b/>
-                <w:bCs/>
-                <w:color w:val="FFFFFF"/>
-                <w:sz w:val="18"/>
-                <w:szCs w:val="18"/>
-              </w:rPr>
-              <w:t xml:space="preserve">Notes</w:t>
-            </w:r>
-          </w:p>
-        </w:tc>
-      </w:tr>
-      <w:tr>
-        <w:tc>
-          <w:tcPr>
-            <w:tcW w:type="dxa" w:w="3200"/>
-            <w:tcBorders>
-              <w:top w:val="single" w:color="D0D8E4" w:sz="4"/>
-              <w:left w:val="single" w:color="D0D8E4" w:sz="4"/>
-              <w:bottom w:val="single" w:color="D0D8E4" w:sz="4"/>
-              <w:right w:val="single" w:color="D0D8E4" w:sz="4"/>
-            </w:tcBorders>
-            <w:shd w:fill="FFFFFF" w:color="auto" w:val="clear"/>
-            <w:tcMar>
-              <w:top w:type="dxa" w:w="50"/>
-              <w:left w:type="dxa" w:w="120"/>
-              <w:bottom w:type="dxa" w:w="50"/>
-              <w:right w:type="dxa" w:w="60"/>
-            </w:tcMar>
-          </w:tcPr>
-          <w:p>
-            <w:r>
-              <w:rPr>
-                <w:rFonts w:ascii="Calibri" w:cs="Calibri" w:eastAsia="Calibri" w:hAnsi="Calibri"/>
-                <w:color w:val="7F7F7F"/>
-                <w:sz w:val="20"/>
-                <w:szCs w:val="20"/>
-              </w:rPr>
-              <w:t xml:space="preserve">1.  </w:t>
-            </w:r>
-          </w:p>
-        </w:tc>
-        <w:tc>
-          <w:tcPr>
-            <w:tcW w:type="dxa" w:w="2000"/>
-            <w:tcBorders>
-              <w:top w:val="single" w:color="D0D8E4" w:sz="4"/>
-              <w:left w:val="single" w:color="D0D8E4" w:sz="4"/>
-              <w:bottom w:val="single" w:color="D0D8E4" w:sz="4"/>
-              <w:right w:val="single" w:color="D0D8E4" w:sz="4"/>
-            </w:tcBorders>
-            <w:shd w:fill="FFFFFF" w:color="auto" w:val="clear"/>
-            <w:tcMar>
-              <w:top w:type="dxa" w:w="50"/>
-              <w:left w:type="dxa" w:w="120"/>
-              <w:bottom w:type="dxa" w:w="50"/>
-              <w:right w:type="dxa" w:w="60"/>
-            </w:tcMar>
-          </w:tcPr>
-          <w:p>
-            <w:r>
-              <w:rPr>
-                <w:rFonts w:ascii="Calibri" w:cs="Calibri" w:eastAsia="Calibri" w:hAnsi="Calibri"/>
-                <w:sz w:val="20"/>
-                <w:szCs w:val="20"/>
-              </w:rPr>
-              <w:t xml:space="preserve"> </w:t>
-            </w:r>
-          </w:p>
-        </w:tc>
-        <w:tc>
-          <w:tcPr>
-            <w:tcW w:type="dxa" w:w="3400"/>
-            <w:tcBorders>
-              <w:top w:val="single" w:color="D0D8E4" w:sz="4"/>
-              <w:left w:val="single" w:color="D0D8E4" w:sz="4"/>
-              <w:bottom w:val="single" w:color="D0D8E4" w:sz="4"/>
-              <w:right w:val="single" w:color="D0D8E4" w:sz="4"/>
-            </w:tcBorders>
-            <w:shd w:fill="FFFFFF" w:color="auto" w:val="clear"/>
-            <w:tcMar>
-              <w:top w:type="dxa" w:w="50"/>
-              <w:left w:type="dxa" w:w="120"/>
-              <w:bottom w:type="dxa" w:w="50"/>
-              <w:right w:type="dxa" w:w="60"/>
-            </w:tcMar>
-          </w:tcPr>
-          <w:p>
-            <w:r>
-              <w:rPr>
-                <w:rFonts w:ascii="Calibri" w:cs="Calibri" w:eastAsia="Calibri" w:hAnsi="Calibri"/>
-                <w:sz w:val="20"/>
-                <w:szCs w:val="20"/>
-              </w:rPr>
-              <w:t xml:space="preserve"> </w:t>
-            </w:r>
-          </w:p>
-        </w:tc>
-        <w:tc>
-          <w:tcPr>
-            <w:tcW w:type="dxa" w:w="2026"/>
-            <w:tcBorders>
-              <w:top w:val="single" w:color="D0D8E4" w:sz="4"/>
-              <w:left w:val="single" w:color="D0D8E4" w:sz="4"/>
-              <w:bottom w:val="single" w:color="D0D8E4" w:sz="4"/>
-              <w:right w:val="single" w:color="D0D8E4" w:sz="4"/>
-            </w:tcBorders>
-            <w:shd w:fill="FFFFFF" w:color="auto" w:val="clear"/>
-            <w:tcMar>
-              <w:top w:type="dxa" w:w="50"/>
-              <w:left w:type="dxa" w:w="120"/>
-              <w:bottom w:type="dxa" w:w="50"/>
-              <w:right w:type="dxa" w:w="60"/>
-            </w:tcMar>
-          </w:tcPr>
-          <w:p>
-            <w:r>
-              <w:rPr>
-                <w:rFonts w:ascii="Calibri" w:cs="Calibri" w:eastAsia="Calibri" w:hAnsi="Calibri"/>
-                <w:sz w:val="20"/>
-                <w:szCs w:val="20"/>
-              </w:rPr>
-              <w:t xml:space="preserve"> </w:t>
-            </w:r>
-          </w:p>
-        </w:tc>
-      </w:tr>
-      <w:tr>
-        <w:tc>
-          <w:tcPr>
-            <w:tcW w:type="dxa" w:w="3200"/>
-            <w:tcBorders>
-              <w:top w:val="single" w:color="D0D8E4" w:sz="4"/>
-              <w:left w:val="single" w:color="D0D8E4" w:sz="4"/>
-              <w:bottom w:val="single" w:color="D0D8E4" w:sz="4"/>
-              <w:right w:val="single" w:color="D0D8E4" w:sz="4"/>
-            </w:tcBorders>
-            <w:shd w:fill="F0F4F8" w:color="auto" w:val="clear"/>
-            <w:tcMar>
-              <w:top w:type="dxa" w:w="50"/>
-              <w:left w:type="dxa" w:w="120"/>
-              <w:bottom w:type="dxa" w:w="50"/>
-              <w:right w:type="dxa" w:w="60"/>
-            </w:tcMar>
-          </w:tcPr>
-          <w:p>
-            <w:r>
-              <w:rPr>
-                <w:rFonts w:ascii="Calibri" w:cs="Calibri" w:eastAsia="Calibri" w:hAnsi="Calibri"/>
-                <w:color w:val="7F7F7F"/>
-                <w:sz w:val="20"/>
-                <w:szCs w:val="20"/>
-              </w:rPr>
-              <w:t xml:space="preserve">2.  </w:t>
-            </w:r>
-          </w:p>
-        </w:tc>
-        <w:tc>
-          <w:tcPr>
-            <w:tcW w:type="dxa" w:w="2000"/>
-            <w:tcBorders>
-              <w:top w:val="single" w:color="D0D8E4" w:sz="4"/>
-              <w:left w:val="single" w:color="D0D8E4" w:sz="4"/>
-              <w:bottom w:val="single" w:color="D0D8E4" w:sz="4"/>
-              <w:right w:val="single" w:color="D0D8E4" w:sz="4"/>
-            </w:tcBorders>
-            <w:shd w:fill="F0F4F8" w:color="auto" w:val="clear"/>
-            <w:tcMar>
-              <w:top w:type="dxa" w:w="50"/>
-              <w:left w:type="dxa" w:w="120"/>
-              <w:bottom w:type="dxa" w:w="50"/>
-              <w:right w:type="dxa" w:w="60"/>
-            </w:tcMar>
-          </w:tcPr>
-          <w:p>
-            <w:r>
-              <w:rPr>
-                <w:rFonts w:ascii="Calibri" w:cs="Calibri" w:eastAsia="Calibri" w:hAnsi="Calibri"/>
-                <w:sz w:val="20"/>
-                <w:szCs w:val="20"/>
-              </w:rPr>
-              <w:t xml:space="preserve"> </w:t>
-            </w:r>
-          </w:p>
-        </w:tc>
-        <w:tc>
-          <w:tcPr>
-            <w:tcW w:type="dxa" w:w="3400"/>
-            <w:tcBorders>
-              <w:top w:val="single" w:color="D0D8E4" w:sz="4"/>
-              <w:left w:val="single" w:color="D0D8E4" w:sz="4"/>
-              <w:bottom w:val="single" w:color="D0D8E4" w:sz="4"/>
-              <w:right w:val="single" w:color="D0D8E4" w:sz="4"/>
-            </w:tcBorders>
-            <w:shd w:fill="F0F4F8" w:color="auto" w:val="clear"/>
-            <w:tcMar>
-              <w:top w:type="dxa" w:w="50"/>
-              <w:left w:type="dxa" w:w="120"/>
-              <w:bottom w:type="dxa" w:w="50"/>
-              <w:right w:type="dxa" w:w="60"/>
-            </w:tcMar>
-          </w:tcPr>
-          <w:p>
-            <w:r>
-              <w:rPr>
-                <w:rFonts w:ascii="Calibri" w:cs="Calibri" w:eastAsia="Calibri" w:hAnsi="Calibri"/>
-                <w:sz w:val="20"/>
-                <w:szCs w:val="20"/>
-              </w:rPr>
-              <w:t xml:space="preserve"> </w:t>
-            </w:r>
-          </w:p>
-        </w:tc>
-        <w:tc>
-          <w:tcPr>
-            <w:tcW w:type="dxa" w:w="2026"/>
-            <w:tcBorders>
-              <w:top w:val="single" w:color="D0D8E4" w:sz="4"/>
-              <w:left w:val="single" w:color="D0D8E4" w:sz="4"/>
-              <w:bottom w:val="single" w:color="D0D8E4" w:sz="4"/>
-              <w:right w:val="single" w:color="D0D8E4" w:sz="4"/>
-            </w:tcBorders>
-            <w:shd w:fill="F0F4F8" w:color="auto" w:val="clear"/>
-            <w:tcMar>
-              <w:top w:type="dxa" w:w="50"/>
-              <w:left w:type="dxa" w:w="120"/>
-              <w:bottom w:type="dxa" w:w="50"/>
-              <w:right w:type="dxa" w:w="60"/>
-            </w:tcMar>
-          </w:tcPr>
-          <w:p>
-            <w:r>
-              <w:rPr>
-                <w:rFonts w:ascii="Calibri" w:cs="Calibri" w:eastAsia="Calibri" w:hAnsi="Calibri"/>
-                <w:sz w:val="20"/>
-                <w:szCs w:val="20"/>
-              </w:rPr>
-              <w:t xml:space="preserve"> </w:t>
-            </w:r>
-          </w:p>
-        </w:tc>
-      </w:tr>
-      <w:tr>
-        <w:tc>
-          <w:tcPr>
-            <w:tcW w:type="dxa" w:w="3200"/>
-            <w:tcBorders>
-              <w:top w:val="single" w:color="D0D8E4" w:sz="4"/>
-              <w:left w:val="single" w:color="D0D8E4" w:sz="4"/>
-              <w:bottom w:val="single" w:color="D0D8E4" w:sz="4"/>
-              <w:right w:val="single" w:color="D0D8E4" w:sz="4"/>
-            </w:tcBorders>
-            <w:shd w:fill="FFFFFF" w:color="auto" w:val="clear"/>
-            <w:tcMar>
-              <w:top w:type="dxa" w:w="50"/>
-              <w:left w:type="dxa" w:w="120"/>
-              <w:bottom w:type="dxa" w:w="50"/>
-              <w:right w:type="dxa" w:w="60"/>
-            </w:tcMar>
-          </w:tcPr>
-          <w:p>
-            <w:r>
-              <w:rPr>
-                <w:rFonts w:ascii="Calibri" w:cs="Calibri" w:eastAsia="Calibri" w:hAnsi="Calibri"/>
-                <w:color w:val="7F7F7F"/>
-                <w:sz w:val="20"/>
-                <w:szCs w:val="20"/>
-              </w:rPr>
-              <w:t xml:space="preserve">3.  </w:t>
-            </w:r>
-          </w:p>
-        </w:tc>
-        <w:tc>
-          <w:tcPr>
-            <w:tcW w:type="dxa" w:w="2000"/>
-            <w:tcBorders>
-              <w:top w:val="single" w:color="D0D8E4" w:sz="4"/>
-              <w:left w:val="single" w:color="D0D8E4" w:sz="4"/>
-              <w:bottom w:val="single" w:color="D0D8E4" w:sz="4"/>
-              <w:right w:val="single" w:color="D0D8E4" w:sz="4"/>
-            </w:tcBorders>
-            <w:shd w:fill="FFFFFF" w:color="auto" w:val="clear"/>
-            <w:tcMar>
-              <w:top w:type="dxa" w:w="50"/>
-              <w:left w:type="dxa" w:w="120"/>
-              <w:bottom w:type="dxa" w:w="50"/>
-              <w:right w:type="dxa" w:w="60"/>
-            </w:tcMar>
-          </w:tcPr>
-          <w:p>
-            <w:r>
-              <w:rPr>
-                <w:rFonts w:ascii="Calibri" w:cs="Calibri" w:eastAsia="Calibri" w:hAnsi="Calibri"/>
-                <w:sz w:val="20"/>
-                <w:szCs w:val="20"/>
-              </w:rPr>
-              <w:t xml:space="preserve"> </w:t>
-            </w:r>
-          </w:p>
-        </w:tc>
-        <w:tc>
-          <w:tcPr>
-            <w:tcW w:type="dxa" w:w="3400"/>
-            <w:tcBorders>
-              <w:top w:val="single" w:color="D0D8E4" w:sz="4"/>
-              <w:left w:val="single" w:color="D0D8E4" w:sz="4"/>
-              <w:bottom w:val="single" w:color="D0D8E4" w:sz="4"/>
-              <w:right w:val="single" w:color="D0D8E4" w:sz="4"/>
-            </w:tcBorders>
-            <w:shd w:fill="FFFFFF" w:color="auto" w:val="clear"/>
-            <w:tcMar>
-              <w:top w:type="dxa" w:w="50"/>
-              <w:left w:type="dxa" w:w="120"/>
-              <w:bottom w:type="dxa" w:w="50"/>
-              <w:right w:type="dxa" w:w="60"/>
-            </w:tcMar>
-          </w:tcPr>
-          <w:p>
-            <w:r>
-              <w:rPr>
-                <w:rFonts w:ascii="Calibri" w:cs="Calibri" w:eastAsia="Calibri" w:hAnsi="Calibri"/>
-                <w:sz w:val="20"/>
-                <w:szCs w:val="20"/>
-              </w:rPr>
-              <w:t xml:space="preserve"> </w:t>
-            </w:r>
-          </w:p>
-        </w:tc>
-        <w:tc>
-          <w:tcPr>
-            <w:tcW w:type="dxa" w:w="2026"/>
-            <w:tcBorders>
-              <w:top w:val="single" w:color="D0D8E4" w:sz="4"/>
-              <w:left w:val="single" w:color="D0D8E4" w:sz="4"/>
-              <w:bottom w:val="single" w:color="D0D8E4" w:sz="4"/>
-              <w:right w:val="single" w:color="D0D8E4" w:sz="4"/>
-            </w:tcBorders>
-            <w:shd w:fill="FFFFFF" w:color="auto" w:val="clear"/>
-            <w:tcMar>
-              <w:top w:type="dxa" w:w="50"/>
-              <w:left w:type="dxa" w:w="120"/>
-              <w:bottom w:type="dxa" w:w="50"/>
-              <w:right w:type="dxa" w:w="60"/>
-            </w:tcMar>
-          </w:tcPr>
-          <w:p>
-            <w:r>
-              <w:rPr>
-                <w:rFonts w:ascii="Calibri" w:cs="Calibri" w:eastAsia="Calibri" w:hAnsi="Calibri"/>
-                <w:sz w:val="20"/>
-                <w:szCs w:val="20"/>
-              </w:rPr>
-              <w:t xml:space="preserve"> </w:t>
-            </w:r>
-          </w:p>
-        </w:tc>
-      </w:tr>
-      <w:tr>
-        <w:tc>
-          <w:tcPr>
-            <w:tcW w:type="dxa" w:w="3200"/>
-            <w:tcBorders>
-              <w:top w:val="single" w:color="D0D8E4" w:sz="4"/>
-              <w:left w:val="single" w:color="D0D8E4" w:sz="4"/>
-              <w:bottom w:val="single" w:color="D0D8E4" w:sz="4"/>
-              <w:right w:val="single" w:color="D0D8E4" w:sz="4"/>
-            </w:tcBorders>
-            <w:shd w:fill="F0F4F8" w:color="auto" w:val="clear"/>
-            <w:tcMar>
-              <w:top w:type="dxa" w:w="50"/>
-              <w:left w:type="dxa" w:w="120"/>
-              <w:bottom w:type="dxa" w:w="50"/>
-              <w:right w:type="dxa" w:w="60"/>
-            </w:tcMar>
-          </w:tcPr>
-          <w:p>
-            <w:r>
-              <w:rPr>
-                <w:rFonts w:ascii="Calibri" w:cs="Calibri" w:eastAsia="Calibri" w:hAnsi="Calibri"/>
-                <w:color w:val="7F7F7F"/>
-                <w:sz w:val="20"/>
-                <w:szCs w:val="20"/>
-              </w:rPr>
-              <w:t xml:space="preserve">4.  </w:t>
-            </w:r>
-          </w:p>
-        </w:tc>
-        <w:tc>
-          <w:tcPr>
-            <w:tcW w:type="dxa" w:w="2000"/>
-            <w:tcBorders>
-              <w:top w:val="single" w:color="D0D8E4" w:sz="4"/>
-              <w:left w:val="single" w:color="D0D8E4" w:sz="4"/>
-              <w:bottom w:val="single" w:color="D0D8E4" w:sz="4"/>
-              <w:right w:val="single" w:color="D0D8E4" w:sz="4"/>
-            </w:tcBorders>
-            <w:shd w:fill="F0F4F8" w:color="auto" w:val="clear"/>
-            <w:tcMar>
-              <w:top w:type="dxa" w:w="50"/>
-              <w:left w:type="dxa" w:w="120"/>
-              <w:bottom w:type="dxa" w:w="50"/>
-              <w:right w:type="dxa" w:w="60"/>
-            </w:tcMar>
-          </w:tcPr>
-          <w:p>
-            <w:r>
-              <w:rPr>
-                <w:rFonts w:ascii="Calibri" w:cs="Calibri" w:eastAsia="Calibri" w:hAnsi="Calibri"/>
-                <w:sz w:val="20"/>
-                <w:szCs w:val="20"/>
-              </w:rPr>
-              <w:t xml:space="preserve"> </w:t>
-            </w:r>
-          </w:p>
-        </w:tc>
-        <w:tc>
-          <w:tcPr>
-            <w:tcW w:type="dxa" w:w="3400"/>
-            <w:tcBorders>
-              <w:top w:val="single" w:color="D0D8E4" w:sz="4"/>
-              <w:left w:val="single" w:color="D0D8E4" w:sz="4"/>
-              <w:bottom w:val="single" w:color="D0D8E4" w:sz="4"/>
-              <w:right w:val="single" w:color="D0D8E4" w:sz="4"/>
-            </w:tcBorders>
-            <w:shd w:fill="F0F4F8" w:color="auto" w:val="clear"/>
-            <w:tcMar>
-              <w:top w:type="dxa" w:w="50"/>
-              <w:left w:type="dxa" w:w="120"/>
-              <w:bottom w:type="dxa" w:w="50"/>
-              <w:right w:type="dxa" w:w="60"/>
-            </w:tcMar>
-          </w:tcPr>
-          <w:p>
-            <w:r>
-              <w:rPr>
-                <w:rFonts w:ascii="Calibri" w:cs="Calibri" w:eastAsia="Calibri" w:hAnsi="Calibri"/>
-                <w:sz w:val="20"/>
-                <w:szCs w:val="20"/>
-              </w:rPr>
-              <w:t xml:space="preserve"> </w:t>
-            </w:r>
-          </w:p>
-        </w:tc>
-        <w:tc>
-          <w:tcPr>
-            <w:tcW w:type="dxa" w:w="2026"/>
-            <w:tcBorders>
-              <w:top w:val="single" w:color="D0D8E4" w:sz="4"/>
-              <w:left w:val="single" w:color="D0D8E4" w:sz="4"/>
-              <w:bottom w:val="single" w:color="D0D8E4" w:sz="4"/>
-              <w:right w:val="single" w:color="D0D8E4" w:sz="4"/>
-            </w:tcBorders>
-            <w:shd w:fill="F0F4F8" w:color="auto" w:val="clear"/>
-            <w:tcMar>
-              <w:top w:type="dxa" w:w="50"/>
-              <w:left w:type="dxa" w:w="120"/>
-              <w:bottom w:type="dxa" w:w="50"/>
-              <w:right w:type="dxa" w:w="60"/>
-            </w:tcMar>
-          </w:tcPr>
-          <w:p>
-            <w:r>
-              <w:rPr>
-                <w:rFonts w:ascii="Calibri" w:cs="Calibri" w:eastAsia="Calibri" w:hAnsi="Calibri"/>
-                <w:sz w:val="20"/>
-                <w:szCs w:val="20"/>
-              </w:rPr>
-              <w:t xml:space="preserve"> </w:t>
-            </w:r>
-          </w:p>
-        </w:tc>
-      </w:tr>
-      <w:tr>
-        <w:tc>
-          <w:tcPr>
-            <w:tcW w:type="dxa" w:w="3200"/>
-            <w:tcBorders>
-              <w:top w:val="single" w:color="D0D8E4" w:sz="4"/>
-              <w:left w:val="single" w:color="D0D8E4" w:sz="4"/>
-              <w:bottom w:val="single" w:color="D0D8E4" w:sz="4"/>
-              <w:right w:val="single" w:color="D0D8E4" w:sz="4"/>
-            </w:tcBorders>
-            <w:shd w:fill="FFFFFF" w:color="auto" w:val="clear"/>
-            <w:tcMar>
-              <w:top w:type="dxa" w:w="50"/>
-              <w:left w:type="dxa" w:w="120"/>
-              <w:bottom w:type="dxa" w:w="50"/>
-              <w:right w:type="dxa" w:w="60"/>
-            </w:tcMar>
-          </w:tcPr>
-          <w:p>
-            <w:r>
-              <w:rPr>
-                <w:rFonts w:ascii="Calibri" w:cs="Calibri" w:eastAsia="Calibri" w:hAnsi="Calibri"/>
-                <w:color w:val="7F7F7F"/>
-                <w:sz w:val="20"/>
-                <w:szCs w:val="20"/>
-              </w:rPr>
-              <w:t xml:space="preserve">5.  </w:t>
-            </w:r>
-          </w:p>
-        </w:tc>
-        <w:tc>
-          <w:tcPr>
-            <w:tcW w:type="dxa" w:w="2000"/>
-            <w:tcBorders>
-              <w:top w:val="single" w:color="D0D8E4" w:sz="4"/>
-              <w:left w:val="single" w:color="D0D8E4" w:sz="4"/>
-              <w:bottom w:val="single" w:color="D0D8E4" w:sz="4"/>
-              <w:right w:val="single" w:color="D0D8E4" w:sz="4"/>
-            </w:tcBorders>
-            <w:shd w:fill="FFFFFF" w:color="auto" w:val="clear"/>
-            <w:tcMar>
-              <w:top w:type="dxa" w:w="50"/>
-              <w:left w:type="dxa" w:w="120"/>
-              <w:bottom w:type="dxa" w:w="50"/>
-              <w:right w:type="dxa" w:w="60"/>
-            </w:tcMar>
-          </w:tcPr>
-          <w:p>
-            <w:r>
-              <w:rPr>
-                <w:rFonts w:ascii="Calibri" w:cs="Calibri" w:eastAsia="Calibri" w:hAnsi="Calibri"/>
-                <w:sz w:val="20"/>
-                <w:szCs w:val="20"/>
-              </w:rPr>
-              <w:t xml:space="preserve"> </w:t>
-            </w:r>
-          </w:p>
-        </w:tc>
-        <w:tc>
-          <w:tcPr>
-            <w:tcW w:type="dxa" w:w="3400"/>
-            <w:tcBorders>
-              <w:top w:val="single" w:color="D0D8E4" w:sz="4"/>
-              <w:left w:val="single" w:color="D0D8E4" w:sz="4"/>
-              <w:bottom w:val="single" w:color="D0D8E4" w:sz="4"/>
-              <w:right w:val="single" w:color="D0D8E4" w:sz="4"/>
-            </w:tcBorders>
-            <w:shd w:fill="FFFFFF" w:color="auto" w:val="clear"/>
-            <w:tcMar>
-              <w:top w:type="dxa" w:w="50"/>
-              <w:left w:type="dxa" w:w="120"/>
-              <w:bottom w:type="dxa" w:w="50"/>
-              <w:right w:type="dxa" w:w="60"/>
-            </w:tcMar>
-          </w:tcPr>
-          <w:p>
-            <w:r>
-              <w:rPr>
-                <w:rFonts w:ascii="Calibri" w:cs="Calibri" w:eastAsia="Calibri" w:hAnsi="Calibri"/>
-                <w:sz w:val="20"/>
-                <w:szCs w:val="20"/>
-              </w:rPr>
-              <w:t xml:space="preserve"> </w:t>
-            </w:r>
-          </w:p>
-        </w:tc>
-        <w:tc>
-          <w:tcPr>
-            <w:tcW w:type="dxa" w:w="2026"/>
-            <w:tcBorders>
-              <w:top w:val="single" w:color="D0D8E4" w:sz="4"/>
-              <w:left w:val="single" w:color="D0D8E4" w:sz="4"/>
-              <w:bottom w:val="single" w:color="D0D8E4" w:sz="4"/>
-              <w:right w:val="single" w:color="D0D8E4" w:sz="4"/>
-            </w:tcBorders>
-            <w:shd w:fill="FFFFFF" w:color="auto" w:val="clear"/>
-            <w:tcMar>
-              <w:top w:type="dxa" w:w="50"/>
-              <w:left w:type="dxa" w:w="120"/>
-              <w:bottom w:type="dxa" w:w="50"/>
-              <w:right w:type="dxa" w:w="60"/>
-            </w:tcMar>
-          </w:tcPr>
-          <w:p>
-            <w:r>
-              <w:rPr>
-                <w:rFonts w:ascii="Calibri" w:cs="Calibri" w:eastAsia="Calibri" w:hAnsi="Calibri"/>
-                <w:sz w:val="20"/>
-                <w:szCs w:val="20"/>
-              </w:rPr>
-              <w:t xml:space="preserve"> </w:t>
-            </w:r>
-          </w:p>
-        </w:tc>
-      </w:tr>
-      <w:tr>
-        <w:tc>
-          <w:tcPr>
-            <w:tcW w:type="dxa" w:w="3200"/>
-            <w:tcBorders>
-              <w:top w:val="single" w:color="D0D8E4" w:sz="4"/>
-              <w:left w:val="single" w:color="D0D8E4" w:sz="4"/>
-              <w:bottom w:val="single" w:color="D0D8E4" w:sz="4"/>
-              <w:right w:val="single" w:color="D0D8E4" w:sz="4"/>
-            </w:tcBorders>
-            <w:shd w:fill="F0F4F8" w:color="auto" w:val="clear"/>
-            <w:tcMar>
-              <w:top w:type="dxa" w:w="50"/>
-              <w:left w:type="dxa" w:w="120"/>
-              <w:bottom w:type="dxa" w:w="50"/>
-              <w:right w:type="dxa" w:w="60"/>
-            </w:tcMar>
-          </w:tcPr>
-          <w:p>
-            <w:r>
-              <w:rPr>
-                <w:rFonts w:ascii="Calibri" w:cs="Calibri" w:eastAsia="Calibri" w:hAnsi="Calibri"/>
-                <w:color w:val="7F7F7F"/>
-                <w:sz w:val="20"/>
-                <w:szCs w:val="20"/>
-              </w:rPr>
-              <w:t xml:space="preserve">6.  </w:t>
-            </w:r>
-          </w:p>
-        </w:tc>
-        <w:tc>
-          <w:tcPr>
-            <w:tcW w:type="dxa" w:w="2000"/>
-            <w:tcBorders>
-              <w:top w:val="single" w:color="D0D8E4" w:sz="4"/>
-              <w:left w:val="single" w:color="D0D8E4" w:sz="4"/>
-              <w:bottom w:val="single" w:color="D0D8E4" w:sz="4"/>
-              <w:right w:val="single" w:color="D0D8E4" w:sz="4"/>
-            </w:tcBorders>
-            <w:shd w:fill="F0F4F8" w:color="auto" w:val="clear"/>
-            <w:tcMar>
-              <w:top w:type="dxa" w:w="50"/>
-              <w:left w:type="dxa" w:w="120"/>
-              <w:bottom w:type="dxa" w:w="50"/>
-              <w:right w:type="dxa" w:w="60"/>
-            </w:tcMar>
-          </w:tcPr>
-          <w:p>
-            <w:r>
-              <w:rPr>
-                <w:rFonts w:ascii="Calibri" w:cs="Calibri" w:eastAsia="Calibri" w:hAnsi="Calibri"/>
-                <w:sz w:val="20"/>
-                <w:szCs w:val="20"/>
-              </w:rPr>
-              <w:t xml:space="preserve"> </w:t>
-            </w:r>
-          </w:p>
-        </w:tc>
-        <w:tc>
-          <w:tcPr>
-            <w:tcW w:type="dxa" w:w="3400"/>
-            <w:tcBorders>
-              <w:top w:val="single" w:color="D0D8E4" w:sz="4"/>
-              <w:left w:val="single" w:color="D0D8E4" w:sz="4"/>
-              <w:bottom w:val="single" w:color="D0D8E4" w:sz="4"/>
-              <w:right w:val="single" w:color="D0D8E4" w:sz="4"/>
-            </w:tcBorders>
-            <w:shd w:fill="F0F4F8" w:color="auto" w:val="clear"/>
-            <w:tcMar>
-              <w:top w:type="dxa" w:w="50"/>
-              <w:left w:type="dxa" w:w="120"/>
-              <w:bottom w:type="dxa" w:w="50"/>
-              <w:right w:type="dxa" w:w="60"/>
-            </w:tcMar>
-          </w:tcPr>
-          <w:p>
-            <w:r>
-              <w:rPr>
-                <w:rFonts w:ascii="Calibri" w:cs="Calibri" w:eastAsia="Calibri" w:hAnsi="Calibri"/>
-                <w:sz w:val="20"/>
-                <w:szCs w:val="20"/>
-              </w:rPr>
-              <w:t xml:space="preserve"> </w:t>
-            </w:r>
-          </w:p>
-        </w:tc>
-        <w:tc>
-          <w:tcPr>
-            <w:tcW w:type="dxa" w:w="2026"/>
-            <w:tcBorders>
-              <w:top w:val="single" w:color="D0D8E4" w:sz="4"/>
-              <w:left w:val="single" w:color="D0D8E4" w:sz="4"/>
-              <w:bottom w:val="single" w:color="D0D8E4" w:sz="4"/>
-              <w:right w:val="single" w:color="D0D8E4" w:sz="4"/>
-            </w:tcBorders>
-            <w:shd w:fill="F0F4F8" w:color="auto" w:val="clear"/>
-            <w:tcMar>
-              <w:top w:type="dxa" w:w="50"/>
-              <w:left w:type="dxa" w:w="120"/>
-              <w:bottom w:type="dxa" w:w="50"/>
-              <w:right w:type="dxa" w:w="60"/>
-            </w:tcMar>
-          </w:tcPr>
-          <w:p>
-            <w:r>
-              <w:rPr>
-                <w:rFonts w:ascii="Calibri" w:cs="Calibri" w:eastAsia="Calibri" w:hAnsi="Calibri"/>
-                <w:sz w:val="20"/>
-                <w:szCs w:val="20"/>
-              </w:rPr>
-              <w:t xml:space="preserve"> </w:t>
-            </w:r>
-          </w:p>
-        </w:tc>
-      </w:tr>
-      <w:tr>
-        <w:tc>
-          <w:tcPr>
-            <w:tcW w:type="dxa" w:w="3200"/>
-            <w:tcBorders>
-              <w:top w:val="single" w:color="D0D8E4" w:sz="4"/>
-              <w:left w:val="single" w:color="D0D8E4" w:sz="4"/>
-              <w:bottom w:val="single" w:color="D0D8E4" w:sz="4"/>
-              <w:right w:val="single" w:color="D0D8E4" w:sz="4"/>
-            </w:tcBorders>
-            <w:shd w:fill="FFFFFF" w:color="auto" w:val="clear"/>
-            <w:tcMar>
-              <w:top w:type="dxa" w:w="50"/>
-              <w:left w:type="dxa" w:w="120"/>
-              <w:bottom w:type="dxa" w:w="50"/>
-              <w:right w:type="dxa" w:w="60"/>
-            </w:tcMar>
-          </w:tcPr>
-          <w:p>
-            <w:r>
-              <w:rPr>
-                <w:rFonts w:ascii="Calibri" w:cs="Calibri" w:eastAsia="Calibri" w:hAnsi="Calibri"/>
-                <w:color w:val="7F7F7F"/>
-                <w:sz w:val="20"/>
-                <w:szCs w:val="20"/>
-              </w:rPr>
-              <w:t xml:space="preserve">7.  </w:t>
-            </w:r>
-          </w:p>
-        </w:tc>
-        <w:tc>
-          <w:tcPr>
-            <w:tcW w:type="dxa" w:w="2000"/>
-            <w:tcBorders>
-              <w:top w:val="single" w:color="D0D8E4" w:sz="4"/>
-              <w:left w:val="single" w:color="D0D8E4" w:sz="4"/>
-              <w:bottom w:val="single" w:color="D0D8E4" w:sz="4"/>
-              <w:right w:val="single" w:color="D0D8E4" w:sz="4"/>
-            </w:tcBorders>
-            <w:shd w:fill="FFFFFF" w:color="auto" w:val="clear"/>
-            <w:tcMar>
-              <w:top w:type="dxa" w:w="50"/>
-              <w:left w:type="dxa" w:w="120"/>
-              <w:bottom w:type="dxa" w:w="50"/>
-              <w:right w:type="dxa" w:w="60"/>
-            </w:tcMar>
-          </w:tcPr>
-          <w:p>
-            <w:r>
-              <w:rPr>
-                <w:rFonts w:ascii="Calibri" w:cs="Calibri" w:eastAsia="Calibri" w:hAnsi="Calibri"/>
-                <w:sz w:val="20"/>
-                <w:szCs w:val="20"/>
-              </w:rPr>
-              <w:t xml:space="preserve"> </w:t>
-            </w:r>
-          </w:p>
-        </w:tc>
-        <w:tc>
-          <w:tcPr>
-            <w:tcW w:type="dxa" w:w="3400"/>
-            <w:tcBorders>
-              <w:top w:val="single" w:color="D0D8E4" w:sz="4"/>
-              <w:left w:val="single" w:color="D0D8E4" w:sz="4"/>
-              <w:bottom w:val="single" w:color="D0D8E4" w:sz="4"/>
-              <w:right w:val="single" w:color="D0D8E4" w:sz="4"/>
-            </w:tcBorders>
-            <w:shd w:fill="FFFFFF" w:color="auto" w:val="clear"/>
-            <w:tcMar>
-              <w:top w:type="dxa" w:w="50"/>
-              <w:left w:type="dxa" w:w="120"/>
-              <w:bottom w:type="dxa" w:w="50"/>
-              <w:right w:type="dxa" w:w="60"/>
-            </w:tcMar>
-          </w:tcPr>
-          <w:p>
-            <w:r>
-              <w:rPr>
-                <w:rFonts w:ascii="Calibri" w:cs="Calibri" w:eastAsia="Calibri" w:hAnsi="Calibri"/>
-                <w:sz w:val="20"/>
-                <w:szCs w:val="20"/>
-              </w:rPr>
-              <w:t xml:space="preserve"> </w:t>
-            </w:r>
-          </w:p>
-        </w:tc>
-        <w:tc>
-          <w:tcPr>
-            <w:tcW w:type="dxa" w:w="2026"/>
-            <w:tcBorders>
-              <w:top w:val="single" w:color="D0D8E4" w:sz="4"/>
-              <w:left w:val="single" w:color="D0D8E4" w:sz="4"/>
-              <w:bottom w:val="single" w:color="D0D8E4" w:sz="4"/>
-              <w:right w:val="single" w:color="D0D8E4" w:sz="4"/>
-            </w:tcBorders>
-            <w:shd w:fill="FFFFFF" w:color="auto" w:val="clear"/>
-            <w:tcMar>
-              <w:top w:type="dxa" w:w="50"/>
-              <w:left w:type="dxa" w:w="120"/>
-              <w:bottom w:type="dxa" w:w="50"/>
-              <w:right w:type="dxa" w:w="60"/>
-            </w:tcMar>
-          </w:tcPr>
-          <w:p>
-            <w:r>
-              <w:rPr>
-                <w:rFonts w:ascii="Calibri" w:cs="Calibri" w:eastAsia="Calibri" w:hAnsi="Calibri"/>
-                <w:sz w:val="20"/>
-                <w:szCs w:val="20"/>
-              </w:rPr>
-              <w:t xml:space="preserve"> </w:t>
-            </w:r>
-          </w:p>
-        </w:tc>
-      </w:tr>
-      <w:tr>
-        <w:tc>
-          <w:tcPr>
-            <w:tcW w:type="dxa" w:w="3200"/>
-            <w:tcBorders>
-              <w:top w:val="single" w:color="D0D8E4" w:sz="4"/>
-              <w:left w:val="single" w:color="D0D8E4" w:sz="4"/>
-              <w:bottom w:val="single" w:color="D0D8E4" w:sz="4"/>
-              <w:right w:val="single" w:color="D0D8E4" w:sz="4"/>
-            </w:tcBorders>
-            <w:shd w:fill="F0F4F8" w:color="auto" w:val="clear"/>
-            <w:tcMar>
-              <w:top w:type="dxa" w:w="50"/>
-              <w:left w:type="dxa" w:w="120"/>
-              <w:bottom w:type="dxa" w:w="50"/>
-              <w:right w:type="dxa" w:w="60"/>
-            </w:tcMar>
-          </w:tcPr>
-          <w:p>
-            <w:r>
-              <w:rPr>
-                <w:rFonts w:ascii="Calibri" w:cs="Calibri" w:eastAsia="Calibri" w:hAnsi="Calibri"/>
-                <w:color w:val="7F7F7F"/>
-                <w:sz w:val="20"/>
-                <w:szCs w:val="20"/>
-              </w:rPr>
-              <w:t xml:space="preserve">8.  </w:t>
-            </w:r>
-          </w:p>
-        </w:tc>
-        <w:tc>
-          <w:tcPr>
-            <w:tcW w:type="dxa" w:w="2000"/>
-            <w:tcBorders>
-              <w:top w:val="single" w:color="D0D8E4" w:sz="4"/>
-              <w:left w:val="single" w:color="D0D8E4" w:sz="4"/>
-              <w:bottom w:val="single" w:color="D0D8E4" w:sz="4"/>
-              <w:right w:val="single" w:color="D0D8E4" w:sz="4"/>
-            </w:tcBorders>
-            <w:shd w:fill="F0F4F8" w:color="auto" w:val="clear"/>
-            <w:tcMar>
-              <w:top w:type="dxa" w:w="50"/>
-              <w:left w:type="dxa" w:w="120"/>
-              <w:bottom w:type="dxa" w:w="50"/>
-              <w:right w:type="dxa" w:w="60"/>
-            </w:tcMar>
-          </w:tcPr>
-          <w:p>
-            <w:r>
-              <w:rPr>
-                <w:rFonts w:ascii="Calibri" w:cs="Calibri" w:eastAsia="Calibri" w:hAnsi="Calibri"/>
-                <w:sz w:val="20"/>
-                <w:szCs w:val="20"/>
-              </w:rPr>
-              <w:t xml:space="preserve"> </w:t>
-            </w:r>
-          </w:p>
-        </w:tc>
-        <w:tc>
-          <w:tcPr>
-            <w:tcW w:type="dxa" w:w="3400"/>
-            <w:tcBorders>
-              <w:top w:val="single" w:color="D0D8E4" w:sz="4"/>
-              <w:left w:val="single" w:color="D0D8E4" w:sz="4"/>
-              <w:bottom w:val="single" w:color="D0D8E4" w:sz="4"/>
-              <w:right w:val="single" w:color="D0D8E4" w:sz="4"/>
-            </w:tcBorders>
-            <w:shd w:fill="F0F4F8" w:color="auto" w:val="clear"/>
-            <w:tcMar>
-              <w:top w:type="dxa" w:w="50"/>
-              <w:left w:type="dxa" w:w="120"/>
-              <w:bottom w:type="dxa" w:w="50"/>
-              <w:right w:type="dxa" w:w="60"/>
-            </w:tcMar>
-          </w:tcPr>
-          <w:p>
-            <w:r>
-              <w:rPr>
-                <w:rFonts w:ascii="Calibri" w:cs="Calibri" w:eastAsia="Calibri" w:hAnsi="Calibri"/>
-                <w:sz w:val="20"/>
-                <w:szCs w:val="20"/>
-              </w:rPr>
-              <w:t xml:space="preserve"> </w:t>
-            </w:r>
-          </w:p>
-        </w:tc>
-        <w:tc>
-          <w:tcPr>
-            <w:tcW w:type="dxa" w:w="2026"/>
-            <w:tcBorders>
-              <w:top w:val="single" w:color="D0D8E4" w:sz="4"/>
-              <w:left w:val="single" w:color="D0D8E4" w:sz="4"/>
-              <w:bottom w:val="single" w:color="D0D8E4" w:sz="4"/>
-              <w:right w:val="single" w:color="D0D8E4" w:sz="4"/>
-            </w:tcBorders>
-            <w:shd w:fill="F0F4F8" w:color="auto" w:val="clear"/>
-            <w:tcMar>
-              <w:top w:type="dxa" w:w="50"/>
-              <w:left w:type="dxa" w:w="120"/>
-              <w:bottom w:type="dxa" w:w="50"/>
-              <w:right w:type="dxa" w:w="60"/>
-            </w:tcMar>
-          </w:tcPr>
-          <w:p>
-            <w:r>
-              <w:rPr>
-                <w:rFonts w:ascii="Calibri" w:cs="Calibri" w:eastAsia="Calibri" w:hAnsi="Calibri"/>
-                <w:sz w:val="20"/>
-                <w:szCs w:val="20"/>
-              </w:rPr>
-              <w:t xml:space="preserve"> </w:t>
-            </w:r>
-          </w:p>
-        </w:tc>
-      </w:tr>
-      <w:tr>
-        <w:tc>
-          <w:tcPr>
-            <w:tcW w:type="dxa" w:w="3200"/>
-            <w:tcBorders>
-              <w:top w:val="single" w:color="D0D8E4" w:sz="4"/>
-              <w:left w:val="single" w:color="D0D8E4" w:sz="4"/>
-              <w:bottom w:val="single" w:color="D0D8E4" w:sz="4"/>
-              <w:right w:val="single" w:color="D0D8E4" w:sz="4"/>
-            </w:tcBorders>
-            <w:shd w:fill="FFFFFF" w:color="auto" w:val="clear"/>
-            <w:tcMar>
-              <w:top w:type="dxa" w:w="50"/>
-              <w:left w:type="dxa" w:w="120"/>
-              <w:bottom w:type="dxa" w:w="50"/>
-              <w:right w:type="dxa" w:w="60"/>
-            </w:tcMar>
-          </w:tcPr>
-          <w:p>
-            <w:r>
-              <w:rPr>
-                <w:rFonts w:ascii="Calibri" w:cs="Calibri" w:eastAsia="Calibri" w:hAnsi="Calibri"/>
-                <w:color w:val="7F7F7F"/>
-                <w:sz w:val="20"/>
-                <w:szCs w:val="20"/>
-              </w:rPr>
-              <w:t xml:space="preserve">9.  </w:t>
-            </w:r>
-          </w:p>
-        </w:tc>
-        <w:tc>
-          <w:tcPr>
-            <w:tcW w:type="dxa" w:w="2000"/>
-            <w:tcBorders>
-              <w:top w:val="single" w:color="D0D8E4" w:sz="4"/>
-              <w:left w:val="single" w:color="D0D8E4" w:sz="4"/>
-              <w:bottom w:val="single" w:color="D0D8E4" w:sz="4"/>
-              <w:right w:val="single" w:color="D0D8E4" w:sz="4"/>
-            </w:tcBorders>
-            <w:shd w:fill="FFFFFF" w:color="auto" w:val="clear"/>
-            <w:tcMar>
-              <w:top w:type="dxa" w:w="50"/>
-              <w:left w:type="dxa" w:w="120"/>
-              <w:bottom w:type="dxa" w:w="50"/>
-              <w:right w:type="dxa" w:w="60"/>
-            </w:tcMar>
-          </w:tcPr>
-          <w:p>
-            <w:r>
-              <w:rPr>
-                <w:rFonts w:ascii="Calibri" w:cs="Calibri" w:eastAsia="Calibri" w:hAnsi="Calibri"/>
-                <w:sz w:val="20"/>
-                <w:szCs w:val="20"/>
-              </w:rPr>
-              <w:t xml:space="preserve"> </w:t>
-            </w:r>
-          </w:p>
-        </w:tc>
-        <w:tc>
-          <w:tcPr>
-            <w:tcW w:type="dxa" w:w="3400"/>
-            <w:tcBorders>
-              <w:top w:val="single" w:color="D0D8E4" w:sz="4"/>
-              <w:left w:val="single" w:color="D0D8E4" w:sz="4"/>
-              <w:bottom w:val="single" w:color="D0D8E4" w:sz="4"/>
-              <w:right w:val="single" w:color="D0D8E4" w:sz="4"/>
-            </w:tcBorders>
-            <w:shd w:fill="FFFFFF" w:color="auto" w:val="clear"/>
-            <w:tcMar>
-              <w:top w:type="dxa" w:w="50"/>
-              <w:left w:type="dxa" w:w="120"/>
-              <w:bottom w:type="dxa" w:w="50"/>
-              <w:right w:type="dxa" w:w="60"/>
-            </w:tcMar>
-          </w:tcPr>
-          <w:p>
-            <w:r>
-              <w:rPr>
-                <w:rFonts w:ascii="Calibri" w:cs="Calibri" w:eastAsia="Calibri" w:hAnsi="Calibri"/>
-                <w:sz w:val="20"/>
-                <w:szCs w:val="20"/>
-              </w:rPr>
-              <w:t xml:space="preserve"> </w:t>
-            </w:r>
-          </w:p>
-        </w:tc>
-        <w:tc>
-          <w:tcPr>
-            <w:tcW w:type="dxa" w:w="2026"/>
-            <w:tcBorders>
-              <w:top w:val="single" w:color="D0D8E4" w:sz="4"/>
-              <w:left w:val="single" w:color="D0D8E4" w:sz="4"/>
-              <w:bottom w:val="single" w:color="D0D8E4" w:sz="4"/>
-              <w:right w:val="single" w:color="D0D8E4" w:sz="4"/>
-            </w:tcBorders>
-            <w:shd w:fill="FFFFFF" w:color="auto" w:val="clear"/>
-            <w:tcMar>
-              <w:top w:type="dxa" w:w="50"/>
-              <w:left w:type="dxa" w:w="120"/>
-              <w:bottom w:type="dxa" w:w="50"/>
-              <w:right w:type="dxa" w:w="60"/>
-            </w:tcMar>
-          </w:tcPr>
-          <w:p>
-            <w:r>
-              <w:rPr>
-                <w:rFonts w:ascii="Calibri" w:cs="Calibri" w:eastAsia="Calibri" w:hAnsi="Calibri"/>
-                <w:sz w:val="20"/>
-                <w:szCs w:val="20"/>
-              </w:rPr>
-              <w:t xml:space="preserve"> </w:t>
-            </w:r>
-          </w:p>
-        </w:tc>
-      </w:tr>
-      <w:tr>
-        <w:tc>
-          <w:tcPr>
-            <w:tcW w:type="dxa" w:w="3200"/>
-            <w:tcBorders>
-              <w:top w:val="single" w:color="D0D8E4" w:sz="4"/>
-              <w:left w:val="single" w:color="D0D8E4" w:sz="4"/>
-              <w:bottom w:val="single" w:color="D0D8E4" w:sz="4"/>
-              <w:right w:val="single" w:color="D0D8E4" w:sz="4"/>
-            </w:tcBorders>
-            <w:shd w:fill="F0F4F8" w:color="auto" w:val="clear"/>
-            <w:tcMar>
-              <w:top w:type="dxa" w:w="50"/>
-              <w:left w:type="dxa" w:w="120"/>
-              <w:bottom w:type="dxa" w:w="50"/>
-              <w:right w:type="dxa" w:w="60"/>
-            </w:tcMar>
-          </w:tcPr>
-          <w:p>
-            <w:r>
-              <w:rPr>
-                <w:rFonts w:ascii="Calibri" w:cs="Calibri" w:eastAsia="Calibri" w:hAnsi="Calibri"/>
-                <w:color w:val="7F7F7F"/>
-                <w:sz w:val="20"/>
-                <w:szCs w:val="20"/>
-              </w:rPr>
-              <w:t xml:space="preserve">10.  </w:t>
-            </w:r>
-          </w:p>
-        </w:tc>
-        <w:tc>
-          <w:tcPr>
-            <w:tcW w:type="dxa" w:w="2000"/>
-            <w:tcBorders>
-              <w:top w:val="single" w:color="D0D8E4" w:sz="4"/>
-              <w:left w:val="single" w:color="D0D8E4" w:sz="4"/>
-              <w:bottom w:val="single" w:color="D0D8E4" w:sz="4"/>
-              <w:right w:val="single" w:color="D0D8E4" w:sz="4"/>
-            </w:tcBorders>
-            <w:shd w:fill="F0F4F8" w:color="auto" w:val="clear"/>
-            <w:tcMar>
-              <w:top w:type="dxa" w:w="50"/>
-              <w:left w:type="dxa" w:w="120"/>
-              <w:bottom w:type="dxa" w:w="50"/>
-              <w:right w:type="dxa" w:w="60"/>
-            </w:tcMar>
-          </w:tcPr>
-          <w:p>
-            <w:r>
-              <w:rPr>
-                <w:rFonts w:ascii="Calibri" w:cs="Calibri" w:eastAsia="Calibri" w:hAnsi="Calibri"/>
-                <w:sz w:val="20"/>
-                <w:szCs w:val="20"/>
-              </w:rPr>
-              <w:t xml:space="preserve"> </w:t>
-            </w:r>
-          </w:p>
-        </w:tc>
-        <w:tc>
-          <w:tcPr>
-            <w:tcW w:type="dxa" w:w="3400"/>
-            <w:tcBorders>
-              <w:top w:val="single" w:color="D0D8E4" w:sz="4"/>
-              <w:left w:val="single" w:color="D0D8E4" w:sz="4"/>
-              <w:bottom w:val="single" w:color="D0D8E4" w:sz="4"/>
-              <w:right w:val="single" w:color="D0D8E4" w:sz="4"/>
-            </w:tcBorders>
-            <w:shd w:fill="F0F4F8" w:color="auto" w:val="clear"/>
-            <w:tcMar>
-              <w:top w:type="dxa" w:w="50"/>
-              <w:left w:type="dxa" w:w="120"/>
-              <w:bottom w:type="dxa" w:w="50"/>
-              <w:right w:type="dxa" w:w="60"/>
-            </w:tcMar>
-          </w:tcPr>
-          <w:p>
-            <w:r>
-              <w:rPr>
-                <w:rFonts w:ascii="Calibri" w:cs="Calibri" w:eastAsia="Calibri" w:hAnsi="Calibri"/>
-                <w:sz w:val="20"/>
-                <w:szCs w:val="20"/>
-              </w:rPr>
-              <w:t xml:space="preserve"> </w:t>
-            </w:r>
-          </w:p>
-        </w:tc>
-        <w:tc>
-          <w:tcPr>
-            <w:tcW w:type="dxa" w:w="2026"/>
-            <w:tcBorders>
-              <w:top w:val="single" w:color="D0D8E4" w:sz="4"/>
-              <w:left w:val="single" w:color="D0D8E4" w:sz="4"/>
-              <w:bottom w:val="single" w:color="D0D8E4" w:sz="4"/>
-              <w:right w:val="single" w:color="D0D8E4" w:sz="4"/>
-            </w:tcBorders>
-            <w:shd w:fill="F0F4F8" w:color="auto" w:val="clear"/>
-            <w:tcMar>
-              <w:top w:type="dxa" w:w="50"/>
-              <w:left w:type="dxa" w:w="120"/>
-              <w:bottom w:type="dxa" w:w="50"/>
-              <w:right w:type="dxa" w:w="60"/>
-            </w:tcMar>
-          </w:tcPr>
-          <w:p>
-            <w:r>
-              <w:rPr>
-                <w:rFonts w:ascii="Calibri" w:cs="Calibri" w:eastAsia="Calibri" w:hAnsi="Calibri"/>
-                <w:sz w:val="20"/>
-                <w:szCs w:val="20"/>
-              </w:rPr>
-              <w:t xml:space="preserve"> </w:t>
-            </w:r>
-          </w:p>
-        </w:tc>
-      </w:tr>
-      <w:tr>
-        <w:tc>
-          <w:tcPr>
-            <w:tcW w:type="dxa" w:w="3200"/>
-            <w:tcBorders>
-              <w:top w:val="single" w:color="D0D8E4" w:sz="4"/>
-              <w:left w:val="single" w:color="D0D8E4" w:sz="4"/>
-              <w:bottom w:val="single" w:color="D0D8E4" w:sz="4"/>
-              <w:right w:val="single" w:color="D0D8E4" w:sz="4"/>
-            </w:tcBorders>
-            <w:shd w:fill="FFFFFF" w:color="auto" w:val="clear"/>
-            <w:tcMar>
-              <w:top w:type="dxa" w:w="50"/>
-              <w:left w:type="dxa" w:w="120"/>
-              <w:bottom w:type="dxa" w:w="50"/>
-              <w:right w:type="dxa" w:w="60"/>
-            </w:tcMar>
-          </w:tcPr>
-          <w:p>
-            <w:r>
-              <w:rPr>
-                <w:rFonts w:ascii="Calibri" w:cs="Calibri" w:eastAsia="Calibri" w:hAnsi="Calibri"/>
-                <w:color w:val="7F7F7F"/>
-                <w:sz w:val="20"/>
-                <w:szCs w:val="20"/>
-              </w:rPr>
-              <w:t xml:space="preserve">11.  </w:t>
-            </w:r>
-          </w:p>
-        </w:tc>
-        <w:tc>
-          <w:tcPr>
-            <w:tcW w:type="dxa" w:w="2000"/>
-            <w:tcBorders>
-              <w:top w:val="single" w:color="D0D8E4" w:sz="4"/>
-              <w:left w:val="single" w:color="D0D8E4" w:sz="4"/>
-              <w:bottom w:val="single" w:color="D0D8E4" w:sz="4"/>
-              <w:right w:val="single" w:color="D0D8E4" w:sz="4"/>
-            </w:tcBorders>
-            <w:shd w:fill="FFFFFF" w:color="auto" w:val="clear"/>
-            <w:tcMar>
-              <w:top w:type="dxa" w:w="50"/>
-              <w:left w:type="dxa" w:w="120"/>
-              <w:bottom w:type="dxa" w:w="50"/>
-              <w:right w:type="dxa" w:w="60"/>
-            </w:tcMar>
-          </w:tcPr>
-          <w:p>
-            <w:r>
-              <w:rPr>
-                <w:rFonts w:ascii="Calibri" w:cs="Calibri" w:eastAsia="Calibri" w:hAnsi="Calibri"/>
-                <w:sz w:val="20"/>
-                <w:szCs w:val="20"/>
-              </w:rPr>
-              <w:t xml:space="preserve"> </w:t>
-            </w:r>
-          </w:p>
-        </w:tc>
-        <w:tc>
-          <w:tcPr>
-            <w:tcW w:type="dxa" w:w="3400"/>
-            <w:tcBorders>
-              <w:top w:val="single" w:color="D0D8E4" w:sz="4"/>
-              <w:left w:val="single" w:color="D0D8E4" w:sz="4"/>
-              <w:bottom w:val="single" w:color="D0D8E4" w:sz="4"/>
-              <w:right w:val="single" w:color="D0D8E4" w:sz="4"/>
-            </w:tcBorders>
-            <w:shd w:fill="FFFFFF" w:color="auto" w:val="clear"/>
-            <w:tcMar>
-              <w:top w:type="dxa" w:w="50"/>
-              <w:left w:type="dxa" w:w="120"/>
-              <w:bottom w:type="dxa" w:w="50"/>
-              <w:right w:type="dxa" w:w="60"/>
-            </w:tcMar>
-          </w:tcPr>
-          <w:p>
-            <w:r>
-              <w:rPr>
-                <w:rFonts w:ascii="Calibri" w:cs="Calibri" w:eastAsia="Calibri" w:hAnsi="Calibri"/>
-                <w:sz w:val="20"/>
-                <w:szCs w:val="20"/>
-              </w:rPr>
-              <w:t xml:space="preserve"> </w:t>
-            </w:r>
-          </w:p>
-        </w:tc>
-        <w:tc>
-          <w:tcPr>
-            <w:tcW w:type="dxa" w:w="2026"/>
-            <w:tcBorders>
-              <w:top w:val="single" w:color="D0D8E4" w:sz="4"/>
-              <w:left w:val="single" w:color="D0D8E4" w:sz="4"/>
-              <w:bottom w:val="single" w:color="D0D8E4" w:sz="4"/>
-              <w:right w:val="single" w:color="D0D8E4" w:sz="4"/>
-            </w:tcBorders>
-            <w:shd w:fill="FFFFFF" w:color="auto" w:val="clear"/>
-            <w:tcMar>
-              <w:top w:type="dxa" w:w="50"/>
-              <w:left w:type="dxa" w:w="120"/>
-              <w:bottom w:type="dxa" w:w="50"/>
-              <w:right w:type="dxa" w:w="60"/>
-            </w:tcMar>
-          </w:tcPr>
-          <w:p>
-            <w:r>
-              <w:rPr>
-                <w:rFonts w:ascii="Calibri" w:cs="Calibri" w:eastAsia="Calibri" w:hAnsi="Calibri"/>
-                <w:sz w:val="20"/>
-                <w:szCs w:val="20"/>
-              </w:rPr>
-              <w:t xml:space="preserve"> </w:t>
-            </w:r>
-          </w:p>
-        </w:tc>
-      </w:tr>
-      <w:tr>
-        <w:tc>
-          <w:tcPr>
-            <w:tcW w:type="dxa" w:w="3200"/>
-            <w:tcBorders>
-              <w:top w:val="single" w:color="D0D8E4" w:sz="4"/>
-              <w:left w:val="single" w:color="D0D8E4" w:sz="4"/>
-              <w:bottom w:val="single" w:color="D0D8E4" w:sz="4"/>
-              <w:right w:val="single" w:color="D0D8E4" w:sz="4"/>
-            </w:tcBorders>
-            <w:shd w:fill="F0F4F8" w:color="auto" w:val="clear"/>
-            <w:tcMar>
-              <w:top w:type="dxa" w:w="50"/>
-              <w:left w:type="dxa" w:w="120"/>
-              <w:bottom w:type="dxa" w:w="50"/>
-              <w:right w:type="dxa" w:w="60"/>
-            </w:tcMar>
-          </w:tcPr>
-          <w:p>
-            <w:r>
-              <w:rPr>
-                <w:rFonts w:ascii="Calibri" w:cs="Calibri" w:eastAsia="Calibri" w:hAnsi="Calibri"/>
-                <w:color w:val="7F7F7F"/>
-                <w:sz w:val="20"/>
-                <w:szCs w:val="20"/>
-              </w:rPr>
-              <w:t xml:space="preserve">12.  </w:t>
-            </w:r>
-          </w:p>
-        </w:tc>
-        <w:tc>
-          <w:tcPr>
-            <w:tcW w:type="dxa" w:w="2000"/>
-            <w:tcBorders>
-              <w:top w:val="single" w:color="D0D8E4" w:sz="4"/>
-              <w:left w:val="single" w:color="D0D8E4" w:sz="4"/>
-              <w:bottom w:val="single" w:color="D0D8E4" w:sz="4"/>
-              <w:right w:val="single" w:color="D0D8E4" w:sz="4"/>
-            </w:tcBorders>
-            <w:shd w:fill="F0F4F8" w:color="auto" w:val="clear"/>
-            <w:tcMar>
-              <w:top w:type="dxa" w:w="50"/>
-              <w:left w:type="dxa" w:w="120"/>
-              <w:bottom w:type="dxa" w:w="50"/>
-              <w:right w:type="dxa" w:w="60"/>
-            </w:tcMar>
-          </w:tcPr>
-          <w:p>
-            <w:r>
-              <w:rPr>
-                <w:rFonts w:ascii="Calibri" w:cs="Calibri" w:eastAsia="Calibri" w:hAnsi="Calibri"/>
-                <w:sz w:val="20"/>
-                <w:szCs w:val="20"/>
-              </w:rPr>
-              <w:t xml:space="preserve"> </w:t>
-            </w:r>
-          </w:p>
-        </w:tc>
-        <w:tc>
-          <w:tcPr>
-            <w:tcW w:type="dxa" w:w="3400"/>
-            <w:tcBorders>
-              <w:top w:val="single" w:color="D0D8E4" w:sz="4"/>
-              <w:left w:val="single" w:color="D0D8E4" w:sz="4"/>
-              <w:bottom w:val="single" w:color="D0D8E4" w:sz="4"/>
-              <w:right w:val="single" w:color="D0D8E4" w:sz="4"/>
-            </w:tcBorders>
-            <w:shd w:fill="F0F4F8" w:color="auto" w:val="clear"/>
-            <w:tcMar>
-              <w:top w:type="dxa" w:w="50"/>
-              <w:left w:type="dxa" w:w="120"/>
-              <w:bottom w:type="dxa" w:w="50"/>
-              <w:right w:type="dxa" w:w="60"/>
-            </w:tcMar>
-          </w:tcPr>
-          <w:p>
-            <w:r>
-              <w:rPr>
-                <w:rFonts w:ascii="Calibri" w:cs="Calibri" w:eastAsia="Calibri" w:hAnsi="Calibri"/>
-                <w:sz w:val="20"/>
-                <w:szCs w:val="20"/>
-              </w:rPr>
-              <w:t xml:space="preserve"> </w:t>
-            </w:r>
-          </w:p>
-        </w:tc>
-        <w:tc>
-          <w:tcPr>
-            <w:tcW w:type="dxa" w:w="2026"/>
-            <w:tcBorders>
-              <w:top w:val="single" w:color="D0D8E4" w:sz="4"/>
-              <w:left w:val="single" w:color="D0D8E4" w:sz="4"/>
-              <w:bottom w:val="single" w:color="D0D8E4" w:sz="4"/>
-              <w:right w:val="single" w:color="D0D8E4" w:sz="4"/>
-            </w:tcBorders>
-            <w:shd w:fill="F0F4F8" w:color="auto" w:val="clear"/>
-            <w:tcMar>
-              <w:top w:type="dxa" w:w="50"/>
-              <w:left w:type="dxa" w:w="120"/>
-              <w:bottom w:type="dxa" w:w="50"/>
-              <w:right w:type="dxa" w:w="60"/>
-            </w:tcMar>
-          </w:tcPr>
-          <w:p>
-            <w:r>
-              <w:rPr>
-                <w:rFonts w:ascii="Calibri" w:cs="Calibri" w:eastAsia="Calibri" w:hAnsi="Calibri"/>
-                <w:sz w:val="20"/>
-                <w:szCs w:val="20"/>
-              </w:rPr>
-              <w:t xml:space="preserve"> </w:t>
-            </w:r>
-          </w:p>
-        </w:tc>
-      </w:tr>
-      <w:tr>
-        <w:tc>
-          <w:tcPr>
-            <w:tcW w:type="dxa" w:w="3200"/>
-            <w:tcBorders>
-              <w:top w:val="single" w:color="D0D8E4" w:sz="4"/>
-              <w:left w:val="single" w:color="D0D8E4" w:sz="4"/>
-              <w:bottom w:val="single" w:color="D0D8E4" w:sz="4"/>
-              <w:right w:val="single" w:color="D0D8E4" w:sz="4"/>
-            </w:tcBorders>
-            <w:shd w:fill="FFFFFF" w:color="auto" w:val="clear"/>
-            <w:tcMar>
-              <w:top w:type="dxa" w:w="50"/>
-              <w:left w:type="dxa" w:w="120"/>
-              <w:bottom w:type="dxa" w:w="50"/>
-              <w:right w:type="dxa" w:w="60"/>
-            </w:tcMar>
-          </w:tcPr>
-          <w:p>
-            <w:r>
-              <w:rPr>
-                <w:rFonts w:ascii="Calibri" w:cs="Calibri" w:eastAsia="Calibri" w:hAnsi="Calibri"/>
-                <w:color w:val="7F7F7F"/>
-                <w:sz w:val="20"/>
-                <w:szCs w:val="20"/>
-              </w:rPr>
-              <w:t xml:space="preserve">13.  </w:t>
-            </w:r>
-          </w:p>
-        </w:tc>
-        <w:tc>
-          <w:tcPr>
-            <w:tcW w:type="dxa" w:w="2000"/>
-            <w:tcBorders>
-              <w:top w:val="single" w:color="D0D8E4" w:sz="4"/>
-              <w:left w:val="single" w:color="D0D8E4" w:sz="4"/>
-              <w:bottom w:val="single" w:color="D0D8E4" w:sz="4"/>
-              <w:right w:val="single" w:color="D0D8E4" w:sz="4"/>
-            </w:tcBorders>
-            <w:shd w:fill="FFFFFF" w:color="auto" w:val="clear"/>
-            <w:tcMar>
-              <w:top w:type="dxa" w:w="50"/>
-              <w:left w:type="dxa" w:w="120"/>
-              <w:bottom w:type="dxa" w:w="50"/>
-              <w:right w:type="dxa" w:w="60"/>
-            </w:tcMar>
-          </w:tcPr>
-          <w:p>
-            <w:r>
-              <w:rPr>
-                <w:rFonts w:ascii="Calibri" w:cs="Calibri" w:eastAsia="Calibri" w:hAnsi="Calibri"/>
-                <w:sz w:val="20"/>
-                <w:szCs w:val="20"/>
-              </w:rPr>
-              <w:t xml:space="preserve"> </w:t>
-            </w:r>
-          </w:p>
-        </w:tc>
-        <w:tc>
-          <w:tcPr>
-            <w:tcW w:type="dxa" w:w="3400"/>
-            <w:tcBorders>
-              <w:top w:val="single" w:color="D0D8E4" w:sz="4"/>
-              <w:left w:val="single" w:color="D0D8E4" w:sz="4"/>
-              <w:bottom w:val="single" w:color="D0D8E4" w:sz="4"/>
-              <w:right w:val="single" w:color="D0D8E4" w:sz="4"/>
-            </w:tcBorders>
-            <w:shd w:fill="FFFFFF" w:color="auto" w:val="clear"/>
-            <w:tcMar>
-              <w:top w:type="dxa" w:w="50"/>
-              <w:left w:type="dxa" w:w="120"/>
-              <w:bottom w:type="dxa" w:w="50"/>
-              <w:right w:type="dxa" w:w="60"/>
-            </w:tcMar>
-          </w:tcPr>
-          <w:p>
-            <w:r>
-              <w:rPr>
-                <w:rFonts w:ascii="Calibri" w:cs="Calibri" w:eastAsia="Calibri" w:hAnsi="Calibri"/>
-                <w:sz w:val="20"/>
-                <w:szCs w:val="20"/>
-              </w:rPr>
-              <w:t xml:space="preserve"> </w:t>
-            </w:r>
-          </w:p>
-        </w:tc>
-        <w:tc>
-          <w:tcPr>
-            <w:tcW w:type="dxa" w:w="2026"/>
-            <w:tcBorders>
-              <w:top w:val="single" w:color="D0D8E4" w:sz="4"/>
-              <w:left w:val="single" w:color="D0D8E4" w:sz="4"/>
-              <w:bottom w:val="single" w:color="D0D8E4" w:sz="4"/>
-              <w:right w:val="single" w:color="D0D8E4" w:sz="4"/>
-            </w:tcBorders>
-            <w:shd w:fill="FFFFFF" w:color="auto" w:val="clear"/>
-            <w:tcMar>
-              <w:top w:type="dxa" w:w="50"/>
-              <w:left w:type="dxa" w:w="120"/>
-              <w:bottom w:type="dxa" w:w="50"/>
-              <w:right w:type="dxa" w:w="60"/>
-            </w:tcMar>
-          </w:tcPr>
-          <w:p>
-            <w:r>
-              <w:rPr>
-                <w:rFonts w:ascii="Calibri" w:cs="Calibri" w:eastAsia="Calibri" w:hAnsi="Calibri"/>
-                <w:sz w:val="20"/>
-                <w:szCs w:val="20"/>
-              </w:rPr>
-              <w:t xml:space="preserve"> </w:t>
-            </w:r>
-          </w:p>
-        </w:tc>
-      </w:tr>
-      <w:tr>
-        <w:tc>
-          <w:tcPr>
-            <w:tcW w:type="dxa" w:w="3200"/>
-            <w:tcBorders>
-              <w:top w:val="single" w:color="D0D8E4" w:sz="4"/>
-              <w:left w:val="single" w:color="D0D8E4" w:sz="4"/>
-              <w:bottom w:val="single" w:color="D0D8E4" w:sz="4"/>
-              <w:right w:val="single" w:color="D0D8E4" w:sz="4"/>
-            </w:tcBorders>
-            <w:shd w:fill="F0F4F8" w:color="auto" w:val="clear"/>
-            <w:tcMar>
-              <w:top w:type="dxa" w:w="50"/>
-              <w:left w:type="dxa" w:w="120"/>
-              <w:bottom w:type="dxa" w:w="50"/>
-              <w:right w:type="dxa" w:w="60"/>
-            </w:tcMar>
-          </w:tcPr>
-          <w:p>
-            <w:r>
-              <w:rPr>
-                <w:rFonts w:ascii="Calibri" w:cs="Calibri" w:eastAsia="Calibri" w:hAnsi="Calibri"/>
-                <w:color w:val="7F7F7F"/>
-                <w:sz w:val="20"/>
-                <w:szCs w:val="20"/>
-              </w:rPr>
-              <w:t xml:space="preserve">14.  </w:t>
-            </w:r>
-          </w:p>
-        </w:tc>
-        <w:tc>
-          <w:tcPr>
-            <w:tcW w:type="dxa" w:w="2000"/>
-            <w:tcBorders>
-              <w:top w:val="single" w:color="D0D8E4" w:sz="4"/>
-              <w:left w:val="single" w:color="D0D8E4" w:sz="4"/>
-              <w:bottom w:val="single" w:color="D0D8E4" w:sz="4"/>
-              <w:right w:val="single" w:color="D0D8E4" w:sz="4"/>
-            </w:tcBorders>
-            <w:shd w:fill="F0F4F8" w:color="auto" w:val="clear"/>
-            <w:tcMar>
-              <w:top w:type="dxa" w:w="50"/>
-              <w:left w:type="dxa" w:w="120"/>
-              <w:bottom w:type="dxa" w:w="50"/>
-              <w:right w:type="dxa" w:w="60"/>
-            </w:tcMar>
-          </w:tcPr>
-          <w:p>
-            <w:r>
-              <w:rPr>
-                <w:rFonts w:ascii="Calibri" w:cs="Calibri" w:eastAsia="Calibri" w:hAnsi="Calibri"/>
-                <w:sz w:val="20"/>
-                <w:szCs w:val="20"/>
-              </w:rPr>
-              <w:t xml:space="preserve"> </w:t>
-            </w:r>
-          </w:p>
-        </w:tc>
-        <w:tc>
-          <w:tcPr>
-            <w:tcW w:type="dxa" w:w="3400"/>
-            <w:tcBorders>
-              <w:top w:val="single" w:color="D0D8E4" w:sz="4"/>
-              <w:left w:val="single" w:color="D0D8E4" w:sz="4"/>
-              <w:bottom w:val="single" w:color="D0D8E4" w:sz="4"/>
-              <w:right w:val="single" w:color="D0D8E4" w:sz="4"/>
-            </w:tcBorders>
-            <w:shd w:fill="F0F4F8" w:color="auto" w:val="clear"/>
-            <w:tcMar>
-              <w:top w:type="dxa" w:w="50"/>
-              <w:left w:type="dxa" w:w="120"/>
-              <w:bottom w:type="dxa" w:w="50"/>
-              <w:right w:type="dxa" w:w="60"/>
-            </w:tcMar>
-          </w:tcPr>
-          <w:p>
-            <w:r>
-              <w:rPr>
-                <w:rFonts w:ascii="Calibri" w:cs="Calibri" w:eastAsia="Calibri" w:hAnsi="Calibri"/>
-                <w:sz w:val="20"/>
-                <w:szCs w:val="20"/>
-              </w:rPr>
-              <w:t xml:space="preserve"> </w:t>
-            </w:r>
-          </w:p>
-        </w:tc>
-        <w:tc>
-          <w:tcPr>
-            <w:tcW w:type="dxa" w:w="2026"/>
-            <w:tcBorders>
-              <w:top w:val="single" w:color="D0D8E4" w:sz="4"/>
-              <w:left w:val="single" w:color="D0D8E4" w:sz="4"/>
-              <w:bottom w:val="single" w:color="D0D8E4" w:sz="4"/>
-              <w:right w:val="single" w:color="D0D8E4" w:sz="4"/>
-            </w:tcBorders>
-            <w:shd w:fill="F0F4F8" w:color="auto" w:val="clear"/>
-            <w:tcMar>
-              <w:top w:type="dxa" w:w="50"/>
-              <w:left w:type="dxa" w:w="120"/>
-              <w:bottom w:type="dxa" w:w="50"/>
-              <w:right w:type="dxa" w:w="60"/>
-            </w:tcMar>
-          </w:tcPr>
-          <w:p>
-            <w:r>
-              <w:rPr>
-                <w:rFonts w:ascii="Calibri" w:cs="Calibri" w:eastAsia="Calibri" w:hAnsi="Calibri"/>
-                <w:sz w:val="20"/>
-                <w:szCs w:val="20"/>
-              </w:rPr>
-              <w:t xml:space="preserve"> </w:t>
-            </w:r>
-          </w:p>
-        </w:tc>
-      </w:tr>
-    </w:tbl>
-    <w:p>
-      <w:pPr>
-        <w:spacing w:after="200" w:before="0"/>
-      </w:pPr>
-    </w:p>
-    <w:tbl>
-      <w:tblPr>
-        <w:tblW w:type="dxa" w:w="10626"/>
-        <w:tblBorders>
-          <w:top w:val="none" w:color="auto" w:sz="0"/>
-          <w:left w:val="none" w:color="auto" w:sz="0"/>
-          <w:bottom w:val="none" w:color="auto" w:sz="0"/>
-          <w:right w:val="none" w:color="auto" w:sz="0"/>
-          <w:insideH w:val="single" w:color="auto" w:sz="4"/>
-          <w:insideV w:val="single" w:color="auto" w:sz="4"/>
-        </w:tblBorders>
-      </w:tblPr>
-      <w:tblGrid>
-        <w:gridCol w:w="10626"/>
-      </w:tblGrid>
-      <w:tr>
-        <w:tc>
-          <w:tcPr>
-            <w:tcW w:type="dxa" w:w="10626"/>
-            <w:shd w:fill="1F3964" w:color="auto" w:val="clear"/>
-            <w:tcMar>
-              <w:top w:type="dxa" w:w="60"/>
-              <w:left w:type="dxa" w:w="160"/>
-              <w:bottom w:type="dxa" w:w="60"/>
-              <w:right w:type="dxa" w:w="160"/>
-            </w:tcMar>
-          </w:tcPr>
-          <w:p>
-            <w:r>
-              <w:rPr>
-                <w:rFonts w:ascii="Calibri" w:cs="Calibri" w:eastAsia="Calibri" w:hAnsi="Calibri"/>
-                <w:b/>
-                <w:bCs/>
-                <w:color w:val="FFFFFF"/>
-                <w:sz w:val="20"/>
-                <w:szCs w:val="20"/>
-              </w:rPr>
-              <w:t xml:space="preserve">B  —  CAPACITY FLAGS  (circle Y or N for each)</w:t>
-            </w:r>
-          </w:p>
-        </w:tc>
-      </w:tr>
-    </w:tbl>
-    <w:p>
-      <w:pPr>
-        <w:spacing w:after="120" w:before="0"/>
-      </w:pPr>
-    </w:p>
-    <w:tbl>
-      <w:tblPr>
-        <w:tblW w:type="dxa" w:w="10626"/>
-        <w:tblBorders>
-          <w:top w:val="none" w:color="auto" w:sz="0"/>
-          <w:left w:val="none" w:color="auto" w:sz="0"/>
-          <w:bottom w:val="none" w:color="auto" w:sz="0"/>
-          <w:right w:val="none" w:color="auto" w:sz="0"/>
-          <w:insideH w:val="single" w:color="auto" w:sz="4"/>
-          <w:insideV w:val="single" w:color="auto" w:sz="4"/>
-        </w:tblBorders>
-      </w:tblPr>
-      <w:tblGrid>
-        <w:gridCol w:w="480"/>
-        <w:gridCol w:w="200"/>
-        <w:gridCol w:w="3200"/>
-        <w:gridCol w:w="6746"/>
-      </w:tblGrid>
-      <w:tr>
-        <w:tc>
-          <w:tcPr>
-            <w:tcW w:type="dxa" w:w="480"/>
-            <w:tcBorders>
-              <w:top w:val="none" w:color="auto" w:sz="0"/>
-              <w:left w:val="none" w:color="auto" w:sz="0"/>
-              <w:bottom w:val="none" w:color="auto" w:sz="0"/>
-              <w:right w:val="none" w:color="auto" w:sz="0"/>
-            </w:tcBorders>
-            <w:tcMar>
-              <w:top w:type="dxa" w:w="60"/>
-              <w:left w:type="dxa" w:w="60"/>
-              <w:bottom w:type="dxa" w:w="60"/>
-              <w:right w:type="dxa" w:w="60"/>
-            </w:tcMar>
-          </w:tcPr>
-          <w:tbl>
-            <w:tblPr>
-              <w:tblW w:type="dxa" w:w="360"/>
-              <w:tblBorders>
-                <w:top w:val="single" w:color="auto" w:sz="4"/>
-                <w:left w:val="single" w:color="auto" w:sz="4"/>
-                <w:bottom w:val="single" w:color="auto" w:sz="4"/>
-                <w:right w:val="single" w:color="auto" w:sz="4"/>
-                <w:insideH w:val="single" w:color="auto" w:sz="4"/>
-                <w:insideV w:val="single" w:color="auto" w:sz="4"/>
-              </w:tblBorders>
-            </w:tblPr>
-            <w:tblGrid>
-              <w:gridCol w:w="180"/>
-              <w:gridCol w:w="180"/>
-            </w:tblGrid>
-            <w:tr>
-              <w:tc>
-                <w:tcPr>
-                  <w:tcW w:type="dxa" w:w="180"/>
-                  <w:tcBorders>
-                    <w:top w:val="single" w:color="1F3964" w:sz="8"/>
-                    <w:left w:val="single" w:color="1F3964" w:sz="8"/>
-                    <w:bottom w:val="single" w:color="1F3964" w:sz="8"/>
-                    <w:right w:val="single" w:color="1F3964" w:sz="8"/>
-                  </w:tcBorders>
-                  <w:shd w:fill="EFF8E8" w:color="auto" w:val="clear"/>
-                  <w:tcMar>
-                    <w:top w:type="dxa" w:w="40"/>
-                    <w:left w:type="dxa" w:w="20"/>
-                    <w:bottom w:type="dxa" w:w="40"/>
-                    <w:right w:type="dxa" w:w="20"/>
-                  </w:tcMar>
-                </w:tcPr>
-                <w:p>
-                  <w:pPr>
-                    <w:jc w:val="center"/>
-                  </w:pPr>
-                  <w:r>
-                    <w:rPr>
-                      <w:rFonts w:ascii="Calibri" w:cs="Calibri" w:eastAsia="Calibri" w:hAnsi="Calibri"/>
-                      <w:b/>
-                      <w:bCs/>
-                      <w:color w:val="375C1B"/>
-                      <w:sz w:val="24"/>
-                      <w:szCs w:val="24"/>
-                    </w:rPr>
-                    <w:t xml:space="preserve">Y</w:t>
-                  </w:r>
-                </w:p>
-              </w:tc>
-              <w:tc>
-                <w:tcPr>
-                  <w:tcW w:type="dxa" w:w="180"/>
-                  <w:tcBorders>
-                    <w:top w:val="single" w:color="1F3964" w:sz="8"/>
-                    <w:left w:val="single" w:color="1F3964" w:sz="8"/>
-                    <w:bottom w:val="single" w:color="1F3964" w:sz="8"/>
-                    <w:right w:val="single" w:color="1F3964" w:sz="8"/>
-                  </w:tcBorders>
-                  <w:shd w:fill="FFF0F0" w:color="auto" w:val="clear"/>
-                  <w:tcMar>
-                    <w:top w:type="dxa" w:w="40"/>
-                    <w:left w:type="dxa" w:w="20"/>
-                    <w:bottom w:type="dxa" w:w="40"/>
-                    <w:right w:type="dxa" w:w="20"/>
-                  </w:tcMar>
-                </w:tcPr>
-                <w:p>
-                  <w:pPr>
-                    <w:jc w:val="center"/>
-                  </w:pPr>
-                  <w:r>
-                    <w:rPr>
-                      <w:rFonts w:ascii="Calibri" w:cs="Calibri" w:eastAsia="Calibri" w:hAnsi="Calibri"/>
-                      <w:b/>
-                      <w:bCs/>
-                      <w:color w:val="C00000"/>
-                      <w:sz w:val="24"/>
-                      <w:szCs w:val="24"/>
-                    </w:rPr>
-                    <w:t xml:space="preserve">N</w:t>
-                  </w:r>
-                </w:p>
-              </w:tc>
-            </w:tr>
-          </w:tbl>
-          <w:p/>
-        </w:tc>
-        <w:tc>
-          <w:tcPr>
-            <w:tcW w:type="dxa" w:w="200"/>
-            <w:tcBorders>
-              <w:top w:val="none" w:color="auto" w:sz="0"/>
-              <w:left w:val="none" w:color="auto" w:sz="0"/>
-              <w:bottom w:val="none" w:color="auto" w:sz="0"/>
-              <w:right w:val="none" w:color="auto" w:sz="0"/>
-            </w:tcBorders>
-            <w:tcMar>
-              <w:top w:type="dxa" w:w="60"/>
-              <w:left w:type="dxa" w:w="80"/>
-              <w:bottom w:type="dxa" w:w="60"/>
-              <w:right w:type="dxa" w:w="80"/>
-            </w:tcMar>
-            <w:vAlign w:val="center"/>
-          </w:tcPr>
-          <w:p>
-            <w:r>
-              <w:rPr>
-                <w:rFonts w:ascii="Calibri" w:cs="Calibri" w:eastAsia="Calibri" w:hAnsi="Calibri"/>
-                <w:sz w:val="18"/>
-                <w:szCs w:val="18"/>
-              </w:rPr>
-              <w:t xml:space="preserve"/>
-            </w:r>
-          </w:p>
-        </w:tc>
-        <w:tc>
-          <w:tcPr>
-            <w:tcW w:type="dxa" w:w="3200"/>
-            <w:tcBorders>
-              <w:top w:val="none" w:color="auto" w:sz="0"/>
-              <w:left w:val="none" w:color="auto" w:sz="0"/>
-              <w:bottom w:val="none" w:color="auto" w:sz="0"/>
-              <w:right w:val="none" w:color="auto" w:sz="0"/>
-            </w:tcBorders>
-            <w:tcMar>
-              <w:top w:type="dxa" w:w="60"/>
-              <w:left w:type="dxa" w:w="0"/>
-              <w:bottom w:type="dxa" w:w="60"/>
-              <w:right w:type="dxa" w:w="60"/>
-            </w:tcMar>
-            <w:vAlign w:val="center"/>
-          </w:tcPr>
-          <w:p>
-            <w:r>
-              <w:rPr>
-                <w:rFonts w:ascii="Calibri" w:cs="Calibri" w:eastAsia="Calibri" w:hAnsi="Calibri"/>
-                <w:color w:val="404040"/>
-                <w:sz w:val="19"/>
-                <w:szCs w:val="19"/>
-              </w:rPr>
-              <w:t xml:space="preserve">Overtime required tomorrow</w:t>
-            </w:r>
-          </w:p>
-        </w:tc>
-        <w:tc>
-          <w:tcPr>
-            <w:tcW w:type="dxa" w:w="6746"/>
-            <w:tcBorders>
-              <w:top w:val="none" w:color="auto" w:sz="0"/>
-              <w:left w:val="none" w:color="auto" w:sz="0"/>
-              <w:bottom w:val="single" w:color="D0D8E4" w:sz="4"/>
-              <w:right w:val="none" w:color="auto" w:sz="0"/>
-            </w:tcBorders>
-            <w:tcMar>
-              <w:top w:type="dxa" w:w="60"/>
-              <w:left w:type="dxa" w:w="80"/>
-              <w:bottom w:type="dxa" w:w="60"/>
-              <w:right w:type="dxa" w:w="0"/>
-            </w:tcMar>
-          </w:tcPr>
-          <w:p>
-            <w:r>
-              <w:rPr>
-                <w:rFonts w:ascii="Calibri" w:cs="Calibri" w:eastAsia="Calibri" w:hAnsi="Calibri"/>
-                <w:i/>
-                <w:iCs/>
-                <w:color w:val="7F7F7F"/>
-                <w:sz w:val="17"/>
-                <w:szCs w:val="17"/>
-              </w:rPr>
-              <w:t xml:space="preserve">Notes:  </w:t>
-            </w:r>
-          </w:p>
-        </w:tc>
-      </w:tr>
-      <w:tr>
-        <w:tc>
-          <w:tcPr>
-            <w:tcW w:type="dxa" w:w="480"/>
-            <w:tcBorders>
-              <w:top w:val="none" w:color="auto" w:sz="0"/>
-              <w:left w:val="none" w:color="auto" w:sz="0"/>
-              <w:bottom w:val="none" w:color="auto" w:sz="0"/>
-              <w:right w:val="none" w:color="auto" w:sz="0"/>
-            </w:tcBorders>
-            <w:tcMar>
-              <w:top w:type="dxa" w:w="60"/>
-              <w:left w:type="dxa" w:w="60"/>
-              <w:bottom w:type="dxa" w:w="60"/>
-              <w:right w:type="dxa" w:w="60"/>
-            </w:tcMar>
-          </w:tcPr>
-          <w:tbl>
-            <w:tblPr>
-              <w:tblW w:type="dxa" w:w="360"/>
-              <w:tblBorders>
-                <w:top w:val="single" w:color="auto" w:sz="4"/>
-                <w:left w:val="single" w:color="auto" w:sz="4"/>
-                <w:bottom w:val="single" w:color="auto" w:sz="4"/>
-                <w:right w:val="single" w:color="auto" w:sz="4"/>
-                <w:insideH w:val="single" w:color="auto" w:sz="4"/>
-                <w:insideV w:val="single" w:color="auto" w:sz="4"/>
-              </w:tblBorders>
-            </w:tblPr>
-            <w:tblGrid>
-              <w:gridCol w:w="180"/>
-              <w:gridCol w:w="180"/>
-            </w:tblGrid>
-            <w:tr>
-              <w:tc>
-                <w:tcPr>
-                  <w:tcW w:type="dxa" w:w="180"/>
-                  <w:tcBorders>
-                    <w:top w:val="single" w:color="1F3964" w:sz="8"/>
-                    <w:left w:val="single" w:color="1F3964" w:sz="8"/>
-                    <w:bottom w:val="single" w:color="1F3964" w:sz="8"/>
-                    <w:right w:val="single" w:color="1F3964" w:sz="8"/>
-                  </w:tcBorders>
-                  <w:shd w:fill="EFF8E8" w:color="auto" w:val="clear"/>
-                  <w:tcMar>
-                    <w:top w:type="dxa" w:w="40"/>
-                    <w:left w:type="dxa" w:w="20"/>
-                    <w:bottom w:type="dxa" w:w="40"/>
-                    <w:right w:type="dxa" w:w="20"/>
-                  </w:tcMar>
-                </w:tcPr>
-                <w:p>
-                  <w:pPr>
-                    <w:jc w:val="center"/>
-                  </w:pPr>
-                  <w:r>
-                    <w:rPr>
-                      <w:rFonts w:ascii="Calibri" w:cs="Calibri" w:eastAsia="Calibri" w:hAnsi="Calibri"/>
-                      <w:b/>
-                      <w:bCs/>
-                      <w:color w:val="375C1B"/>
-                      <w:sz w:val="24"/>
-                      <w:szCs w:val="24"/>
-                    </w:rPr>
-                    <w:t xml:space="preserve">Y</w:t>
-                  </w:r>
-                </w:p>
-              </w:tc>
-              <w:tc>
-                <w:tcPr>
-                  <w:tcW w:type="dxa" w:w="180"/>
-                  <w:tcBorders>
-                    <w:top w:val="single" w:color="1F3964" w:sz="8"/>
-                    <w:left w:val="single" w:color="1F3964" w:sz="8"/>
-                    <w:bottom w:val="single" w:color="1F3964" w:sz="8"/>
-                    <w:right w:val="single" w:color="1F3964" w:sz="8"/>
-                  </w:tcBorders>
-                  <w:shd w:fill="FFF0F0" w:color="auto" w:val="clear"/>
-                  <w:tcMar>
-                    <w:top w:type="dxa" w:w="40"/>
-                    <w:left w:type="dxa" w:w="20"/>
-                    <w:bottom w:type="dxa" w:w="40"/>
-                    <w:right w:type="dxa" w:w="20"/>
-                  </w:tcMar>
-                </w:tcPr>
-                <w:p>
-                  <w:pPr>
-                    <w:jc w:val="center"/>
-                  </w:pPr>
-                  <w:r>
-                    <w:rPr>
-                      <w:rFonts w:ascii="Calibri" w:cs="Calibri" w:eastAsia="Calibri" w:hAnsi="Calibri"/>
-                      <w:b/>
-                      <w:bCs/>
-                      <w:color w:val="C00000"/>
-                      <w:sz w:val="24"/>
-                      <w:szCs w:val="24"/>
-                    </w:rPr>
-                    <w:t xml:space="preserve">N</w:t>
-                  </w:r>
-                </w:p>
-              </w:tc>
-            </w:tr>
-          </w:tbl>
-          <w:p/>
-        </w:tc>
-        <w:tc>
-          <w:tcPr>
-            <w:tcW w:type="dxa" w:w="200"/>
-            <w:tcBorders>
-              <w:top w:val="none" w:color="auto" w:sz="0"/>
-              <w:left w:val="none" w:color="auto" w:sz="0"/>
-              <w:bottom w:val="none" w:color="auto" w:sz="0"/>
-              <w:right w:val="none" w:color="auto" w:sz="0"/>
-            </w:tcBorders>
-            <w:tcMar>
-              <w:top w:type="dxa" w:w="60"/>
-              <w:left w:type="dxa" w:w="80"/>
-              <w:bottom w:type="dxa" w:w="60"/>
-              <w:right w:type="dxa" w:w="80"/>
-            </w:tcMar>
-            <w:vAlign w:val="center"/>
-          </w:tcPr>
-          <w:p>
-            <w:r>
-              <w:rPr>
-                <w:rFonts w:ascii="Calibri" w:cs="Calibri" w:eastAsia="Calibri" w:hAnsi="Calibri"/>
-                <w:sz w:val="18"/>
-                <w:szCs w:val="18"/>
-              </w:rPr>
-              <w:t xml:space="preserve"/>
-            </w:r>
-          </w:p>
-        </w:tc>
-        <w:tc>
-          <w:tcPr>
-            <w:tcW w:type="dxa" w:w="3200"/>
-            <w:tcBorders>
-              <w:top w:val="none" w:color="auto" w:sz="0"/>
-              <w:left w:val="none" w:color="auto" w:sz="0"/>
-              <w:bottom w:val="none" w:color="auto" w:sz="0"/>
-              <w:right w:val="none" w:color="auto" w:sz="0"/>
-            </w:tcBorders>
-            <w:tcMar>
-              <w:top w:type="dxa" w:w="60"/>
-              <w:left w:type="dxa" w:w="0"/>
-              <w:bottom w:type="dxa" w:w="60"/>
-              <w:right w:type="dxa" w:w="60"/>
-            </w:tcMar>
-            <w:vAlign w:val="center"/>
-          </w:tcPr>
-          <w:p>
-            <w:r>
-              <w:rPr>
-                <w:rFonts w:ascii="Calibri" w:cs="Calibri" w:eastAsia="Calibri" w:hAnsi="Calibri"/>
-                <w:color w:val="404040"/>
-                <w:sz w:val="19"/>
-                <w:szCs w:val="19"/>
-              </w:rPr>
-              <w:t xml:space="preserve">Apprentice / trainee requiring direct supervision</w:t>
-            </w:r>
-          </w:p>
-        </w:tc>
-        <w:tc>
-          <w:tcPr>
-            <w:tcW w:type="dxa" w:w="6746"/>
-            <w:tcBorders>
-              <w:top w:val="none" w:color="auto" w:sz="0"/>
-              <w:left w:val="none" w:color="auto" w:sz="0"/>
-              <w:bottom w:val="single" w:color="D0D8E4" w:sz="4"/>
-              <w:right w:val="none" w:color="auto" w:sz="0"/>
-            </w:tcBorders>
-            <w:tcMar>
-              <w:top w:type="dxa" w:w="60"/>
-              <w:left w:type="dxa" w:w="80"/>
-              <w:bottom w:type="dxa" w:w="60"/>
-              <w:right w:type="dxa" w:w="0"/>
-            </w:tcMar>
-          </w:tcPr>
-          <w:p>
-            <w:r>
-              <w:rPr>
-                <w:rFonts w:ascii="Calibri" w:cs="Calibri" w:eastAsia="Calibri" w:hAnsi="Calibri"/>
-                <w:i/>
-                <w:iCs/>
-                <w:color w:val="7F7F7F"/>
-                <w:sz w:val="17"/>
-                <w:szCs w:val="17"/>
-              </w:rPr>
-              <w:t xml:space="preserve">Notes:  </w:t>
-            </w:r>
-          </w:p>
-        </w:tc>
-      </w:tr>
-      <w:tr>
-        <w:tc>
-          <w:tcPr>
-            <w:tcW w:type="dxa" w:w="480"/>
-            <w:tcBorders>
-              <w:top w:val="none" w:color="auto" w:sz="0"/>
-              <w:left w:val="none" w:color="auto" w:sz="0"/>
-              <w:bottom w:val="none" w:color="auto" w:sz="0"/>
-              <w:right w:val="none" w:color="auto" w:sz="0"/>
-            </w:tcBorders>
-            <w:tcMar>
-              <w:top w:type="dxa" w:w="60"/>
-              <w:left w:type="dxa" w:w="60"/>
-              <w:bottom w:type="dxa" w:w="60"/>
-              <w:right w:type="dxa" w:w="60"/>
-            </w:tcMar>
-          </w:tcPr>
-          <w:tbl>
-            <w:tblPr>
-              <w:tblW w:type="dxa" w:w="360"/>
-              <w:tblBorders>
-                <w:top w:val="single" w:color="auto" w:sz="4"/>
-                <w:left w:val="single" w:color="auto" w:sz="4"/>
-                <w:bottom w:val="single" w:color="auto" w:sz="4"/>
-                <w:right w:val="single" w:color="auto" w:sz="4"/>
-                <w:insideH w:val="single" w:color="auto" w:sz="4"/>
-                <w:insideV w:val="single" w:color="auto" w:sz="4"/>
-              </w:tblBorders>
-            </w:tblPr>
-            <w:tblGrid>
-              <w:gridCol w:w="180"/>
-              <w:gridCol w:w="180"/>
-            </w:tblGrid>
-            <w:tr>
-              <w:tc>
-                <w:tcPr>
-                  <w:tcW w:type="dxa" w:w="180"/>
-                  <w:tcBorders>
-                    <w:top w:val="single" w:color="1F3964" w:sz="8"/>
-                    <w:left w:val="single" w:color="1F3964" w:sz="8"/>
-                    <w:bottom w:val="single" w:color="1F3964" w:sz="8"/>
-                    <w:right w:val="single" w:color="1F3964" w:sz="8"/>
-                  </w:tcBorders>
-                  <w:shd w:fill="EFF8E8" w:color="auto" w:val="clear"/>
-                  <w:tcMar>
-                    <w:top w:type="dxa" w:w="40"/>
-                    <w:left w:type="dxa" w:w="20"/>
-                    <w:bottom w:type="dxa" w:w="40"/>
-                    <w:right w:type="dxa" w:w="20"/>
-                  </w:tcMar>
-                </w:tcPr>
-                <w:p>
-                  <w:pPr>
-                    <w:jc w:val="center"/>
-                  </w:pPr>
-                  <w:r>
-                    <w:rPr>
-                      <w:rFonts w:ascii="Calibri" w:cs="Calibri" w:eastAsia="Calibri" w:hAnsi="Calibri"/>
-                      <w:b/>
-                      <w:bCs/>
-                      <w:color w:val="375C1B"/>
-                      <w:sz w:val="24"/>
-                      <w:szCs w:val="24"/>
-                    </w:rPr>
-                    <w:t xml:space="preserve">Y</w:t>
-                  </w:r>
-                </w:p>
-              </w:tc>
-              <w:tc>
-                <w:tcPr>
-                  <w:tcW w:type="dxa" w:w="180"/>
-                  <w:tcBorders>
-                    <w:top w:val="single" w:color="1F3964" w:sz="8"/>
-                    <w:left w:val="single" w:color="1F3964" w:sz="8"/>
-                    <w:bottom w:val="single" w:color="1F3964" w:sz="8"/>
-                    <w:right w:val="single" w:color="1F3964" w:sz="8"/>
-                  </w:tcBorders>
-                  <w:shd w:fill="FFF0F0" w:color="auto" w:val="clear"/>
-                  <w:tcMar>
-                    <w:top w:type="dxa" w:w="40"/>
-                    <w:left w:type="dxa" w:w="20"/>
-                    <w:bottom w:type="dxa" w:w="40"/>
-                    <w:right w:type="dxa" w:w="20"/>
-                  </w:tcMar>
-                </w:tcPr>
-                <w:p>
-                  <w:pPr>
-                    <w:jc w:val="center"/>
-                  </w:pPr>
-                  <w:r>
-                    <w:rPr>
-                      <w:rFonts w:ascii="Calibri" w:cs="Calibri" w:eastAsia="Calibri" w:hAnsi="Calibri"/>
-                      <w:b/>
-                      <w:bCs/>
-                      <w:color w:val="C00000"/>
-                      <w:sz w:val="24"/>
-                      <w:szCs w:val="24"/>
-                    </w:rPr>
-                    <w:t xml:space="preserve">N</w:t>
-                  </w:r>
-                </w:p>
-              </w:tc>
-            </w:tr>
-          </w:tbl>
-          <w:p/>
-        </w:tc>
-        <w:tc>
-          <w:tcPr>
-            <w:tcW w:type="dxa" w:w="200"/>
-            <w:tcBorders>
-              <w:top w:val="none" w:color="auto" w:sz="0"/>
-              <w:left w:val="none" w:color="auto" w:sz="0"/>
-              <w:bottom w:val="none" w:color="auto" w:sz="0"/>
-              <w:right w:val="none" w:color="auto" w:sz="0"/>
-            </w:tcBorders>
-            <w:tcMar>
-              <w:top w:type="dxa" w:w="60"/>
-              <w:left w:type="dxa" w:w="80"/>
-              <w:bottom w:type="dxa" w:w="60"/>
-              <w:right w:type="dxa" w:w="80"/>
-            </w:tcMar>
-            <w:vAlign w:val="center"/>
-          </w:tcPr>
-          <w:p>
-            <w:r>
-              <w:rPr>
-                <w:rFonts w:ascii="Calibri" w:cs="Calibri" w:eastAsia="Calibri" w:hAnsi="Calibri"/>
-                <w:sz w:val="18"/>
-                <w:szCs w:val="18"/>
-              </w:rPr>
-              <w:t xml:space="preserve"/>
-            </w:r>
-          </w:p>
-        </w:tc>
-        <w:tc>
-          <w:tcPr>
-            <w:tcW w:type="dxa" w:w="3200"/>
-            <w:tcBorders>
-              <w:top w:val="none" w:color="auto" w:sz="0"/>
-              <w:left w:val="none" w:color="auto" w:sz="0"/>
-              <w:bottom w:val="none" w:color="auto" w:sz="0"/>
-              <w:right w:val="none" w:color="auto" w:sz="0"/>
-            </w:tcBorders>
-            <w:tcMar>
-              <w:top w:type="dxa" w:w="60"/>
-              <w:left w:type="dxa" w:w="0"/>
-              <w:bottom w:type="dxa" w:w="60"/>
-              <w:right w:type="dxa" w:w="60"/>
-            </w:tcMar>
-            <w:vAlign w:val="center"/>
-          </w:tcPr>
-          <w:p>
-            <w:r>
-              <w:rPr>
-                <w:rFonts w:ascii="Calibri" w:cs="Calibri" w:eastAsia="Calibri" w:hAnsi="Calibri"/>
-                <w:color w:val="404040"/>
-                <w:sz w:val="19"/>
-                <w:szCs w:val="19"/>
-              </w:rPr>
-              <w:t xml:space="preserve">Visitors or contractors on the floor</w:t>
-            </w:r>
-          </w:p>
-        </w:tc>
-        <w:tc>
-          <w:tcPr>
-            <w:tcW w:type="dxa" w:w="6746"/>
-            <w:tcBorders>
-              <w:top w:val="none" w:color="auto" w:sz="0"/>
-              <w:left w:val="none" w:color="auto" w:sz="0"/>
-              <w:bottom w:val="single" w:color="D0D8E4" w:sz="4"/>
-              <w:right w:val="none" w:color="auto" w:sz="0"/>
-            </w:tcBorders>
-            <w:tcMar>
-              <w:top w:type="dxa" w:w="60"/>
-              <w:left w:type="dxa" w:w="80"/>
-              <w:bottom w:type="dxa" w:w="60"/>
-              <w:right w:type="dxa" w:w="0"/>
-            </w:tcMar>
-          </w:tcPr>
-          <w:p>
-            <w:r>
-              <w:rPr>
-                <w:rFonts w:ascii="Calibri" w:cs="Calibri" w:eastAsia="Calibri" w:hAnsi="Calibri"/>
-                <w:i/>
-                <w:iCs/>
-                <w:color w:val="7F7F7F"/>
-                <w:sz w:val="17"/>
-                <w:szCs w:val="17"/>
-              </w:rPr>
-              <w:t xml:space="preserve">Notes:  </w:t>
-            </w:r>
-          </w:p>
-        </w:tc>
-      </w:tr>
-      <w:tr>
-        <w:tc>
-          <w:tcPr>
-            <w:tcW w:type="dxa" w:w="480"/>
-            <w:tcBorders>
-              <w:top w:val="none" w:color="auto" w:sz="0"/>
-              <w:left w:val="none" w:color="auto" w:sz="0"/>
-              <w:bottom w:val="none" w:color="auto" w:sz="0"/>
-              <w:right w:val="none" w:color="auto" w:sz="0"/>
-            </w:tcBorders>
-            <w:tcMar>
-              <w:top w:type="dxa" w:w="60"/>
-              <w:left w:type="dxa" w:w="60"/>
-              <w:bottom w:type="dxa" w:w="60"/>
-              <w:right w:type="dxa" w:w="60"/>
-            </w:tcMar>
-          </w:tcPr>
-          <w:tbl>
-            <w:tblPr>
-              <w:tblW w:type="dxa" w:w="360"/>
-              <w:tblBorders>
-                <w:top w:val="single" w:color="auto" w:sz="4"/>
-                <w:left w:val="single" w:color="auto" w:sz="4"/>
-                <w:bottom w:val="single" w:color="auto" w:sz="4"/>
-                <w:right w:val="single" w:color="auto" w:sz="4"/>
-                <w:insideH w:val="single" w:color="auto" w:sz="4"/>
-                <w:insideV w:val="single" w:color="auto" w:sz="4"/>
-              </w:tblBorders>
-            </w:tblPr>
-            <w:tblGrid>
-              <w:gridCol w:w="180"/>
-              <w:gridCol w:w="180"/>
-            </w:tblGrid>
-            <w:tr>
-              <w:tc>
-                <w:tcPr>
-                  <w:tcW w:type="dxa" w:w="180"/>
-                  <w:tcBorders>
-                    <w:top w:val="single" w:color="1F3964" w:sz="8"/>
-                    <w:left w:val="single" w:color="1F3964" w:sz="8"/>
-                    <w:bottom w:val="single" w:color="1F3964" w:sz="8"/>
-                    <w:right w:val="single" w:color="1F3964" w:sz="8"/>
-                  </w:tcBorders>
-                  <w:shd w:fill="EFF8E8" w:color="auto" w:val="clear"/>
-                  <w:tcMar>
-                    <w:top w:type="dxa" w:w="40"/>
-                    <w:left w:type="dxa" w:w="20"/>
-                    <w:bottom w:type="dxa" w:w="40"/>
-                    <w:right w:type="dxa" w:w="20"/>
-                  </w:tcMar>
-                </w:tcPr>
-                <w:p>
-                  <w:pPr>
-                    <w:jc w:val="center"/>
-                  </w:pPr>
-                  <w:r>
-                    <w:rPr>
-                      <w:rFonts w:ascii="Calibri" w:cs="Calibri" w:eastAsia="Calibri" w:hAnsi="Calibri"/>
-                      <w:b/>
-                      <w:bCs/>
-                      <w:color w:val="375C1B"/>
-                      <w:sz w:val="24"/>
-                      <w:szCs w:val="24"/>
-                    </w:rPr>
-                    <w:t xml:space="preserve">Y</w:t>
-                  </w:r>
-                </w:p>
-              </w:tc>
-              <w:tc>
-                <w:tcPr>
-                  <w:tcW w:type="dxa" w:w="180"/>
-                  <w:tcBorders>
-                    <w:top w:val="single" w:color="1F3964" w:sz="8"/>
-                    <w:left w:val="single" w:color="1F3964" w:sz="8"/>
-                    <w:bottom w:val="single" w:color="1F3964" w:sz="8"/>
-                    <w:right w:val="single" w:color="1F3964" w:sz="8"/>
-                  </w:tcBorders>
-                  <w:shd w:fill="FFF0F0" w:color="auto" w:val="clear"/>
-                  <w:tcMar>
-                    <w:top w:type="dxa" w:w="40"/>
-                    <w:left w:type="dxa" w:w="20"/>
-                    <w:bottom w:type="dxa" w:w="40"/>
-                    <w:right w:type="dxa" w:w="20"/>
-                  </w:tcMar>
-                </w:tcPr>
-                <w:p>
-                  <w:pPr>
-                    <w:jc w:val="center"/>
-                  </w:pPr>
-                  <w:r>
-                    <w:rPr>
-                      <w:rFonts w:ascii="Calibri" w:cs="Calibri" w:eastAsia="Calibri" w:hAnsi="Calibri"/>
-                      <w:b/>
-                      <w:bCs/>
-                      <w:color w:val="C00000"/>
-                      <w:sz w:val="24"/>
-                      <w:szCs w:val="24"/>
-                    </w:rPr>
-                    <w:t xml:space="preserve">N</w:t>
-                  </w:r>
-                </w:p>
-              </w:tc>
-            </w:tr>
-          </w:tbl>
-          <w:p/>
-        </w:tc>
-        <w:tc>
-          <w:tcPr>
-            <w:tcW w:type="dxa" w:w="200"/>
-            <w:tcBorders>
-              <w:top w:val="none" w:color="auto" w:sz="0"/>
-              <w:left w:val="none" w:color="auto" w:sz="0"/>
-              <w:bottom w:val="none" w:color="auto" w:sz="0"/>
-              <w:right w:val="none" w:color="auto" w:sz="0"/>
-            </w:tcBorders>
-            <w:tcMar>
-              <w:top w:type="dxa" w:w="60"/>
-              <w:left w:type="dxa" w:w="80"/>
-              <w:bottom w:type="dxa" w:w="60"/>
-              <w:right w:type="dxa" w:w="80"/>
-            </w:tcMar>
-            <w:vAlign w:val="center"/>
-          </w:tcPr>
-          <w:p>
-            <w:r>
-              <w:rPr>
-                <w:rFonts w:ascii="Calibri" w:cs="Calibri" w:eastAsia="Calibri" w:hAnsi="Calibri"/>
-                <w:sz w:val="18"/>
-                <w:szCs w:val="18"/>
-              </w:rPr>
-              <w:t xml:space="preserve"/>
-            </w:r>
-          </w:p>
-        </w:tc>
-        <w:tc>
-          <w:tcPr>
-            <w:tcW w:type="dxa" w:w="3200"/>
-            <w:tcBorders>
-              <w:top w:val="none" w:color="auto" w:sz="0"/>
-              <w:left w:val="none" w:color="auto" w:sz="0"/>
-              <w:bottom w:val="none" w:color="auto" w:sz="0"/>
-              <w:right w:val="none" w:color="auto" w:sz="0"/>
-            </w:tcBorders>
-            <w:tcMar>
-              <w:top w:type="dxa" w:w="60"/>
-              <w:left w:type="dxa" w:w="0"/>
-              <w:bottom w:type="dxa" w:w="60"/>
-              <w:right w:type="dxa" w:w="60"/>
-            </w:tcMar>
-            <w:vAlign w:val="center"/>
-          </w:tcPr>
-          <w:p>
-            <w:r>
-              <w:rPr>
-                <w:rFonts w:ascii="Calibri" w:cs="Calibri" w:eastAsia="Calibri" w:hAnsi="Calibri"/>
-                <w:color w:val="404040"/>
-                <w:sz w:val="19"/>
-                <w:szCs w:val="19"/>
-              </w:rPr>
-              <w:t xml:space="preserve">Skill gap for any of tomorrow's jobs</w:t>
-            </w:r>
-          </w:p>
-        </w:tc>
-        <w:tc>
-          <w:tcPr>
-            <w:tcW w:type="dxa" w:w="6746"/>
-            <w:tcBorders>
-              <w:top w:val="none" w:color="auto" w:sz="0"/>
-              <w:left w:val="none" w:color="auto" w:sz="0"/>
-              <w:bottom w:val="single" w:color="D0D8E4" w:sz="4"/>
-              <w:right w:val="none" w:color="auto" w:sz="0"/>
-            </w:tcBorders>
-            <w:tcMar>
-              <w:top w:type="dxa" w:w="60"/>
-              <w:left w:type="dxa" w:w="80"/>
-              <w:bottom w:type="dxa" w:w="60"/>
-              <w:right w:type="dxa" w:w="0"/>
-            </w:tcMar>
-          </w:tcPr>
-          <w:p>
-            <w:r>
-              <w:rPr>
-                <w:rFonts w:ascii="Calibri" w:cs="Calibri" w:eastAsia="Calibri" w:hAnsi="Calibri"/>
-                <w:i/>
-                <w:iCs/>
-                <w:color w:val="7F7F7F"/>
-                <w:sz w:val="17"/>
-                <w:szCs w:val="17"/>
-              </w:rPr>
-              <w:t xml:space="preserve">Notes:  </w:t>
-            </w:r>
-          </w:p>
-        </w:tc>
-      </w:tr>
-    </w:tbl>
-    <w:p>
-      <w:pPr>
-        <w:spacing w:after="200" w:before="0"/>
-      </w:pPr>
-    </w:p>
-    <w:tbl>
-      <w:tblPr>
-        <w:tblW w:type="dxa" w:w="10626"/>
-        <w:tblBorders>
-          <w:top w:val="none" w:color="auto" w:sz="0"/>
-          <w:left w:val="none" w:color="auto" w:sz="0"/>
-          <w:bottom w:val="none" w:color="auto" w:sz="0"/>
-          <w:right w:val="none" w:color="auto" w:sz="0"/>
-          <w:insideH w:val="single" w:color="auto" w:sz="4"/>
-          <w:insideV w:val="single" w:color="auto" w:sz="4"/>
-        </w:tblBorders>
-      </w:tblPr>
-      <w:tblGrid>
-        <w:gridCol w:w="10626"/>
-      </w:tblGrid>
-      <w:tr>
-        <w:tc>
-          <w:tcPr>
-            <w:tcW w:type="dxa" w:w="10626"/>
-            <w:shd w:fill="1F3964" w:color="auto" w:val="clear"/>
-            <w:tcMar>
-              <w:top w:type="dxa" w:w="60"/>
-              <w:left w:type="dxa" w:w="160"/>
-              <w:bottom w:type="dxa" w:w="60"/>
-              <w:right w:type="dxa" w:w="160"/>
-            </w:tcMar>
-          </w:tcPr>
-          <w:p>
-            <w:r>
-              <w:rPr>
-                <w:rFonts w:ascii="Calibri" w:cs="Calibri" w:eastAsia="Calibri" w:hAnsi="Calibri"/>
-                <w:b/>
-                <w:bCs/>
-                <w:color w:val="FFFFFF"/>
-                <w:sz w:val="20"/>
-                <w:szCs w:val="20"/>
-              </w:rPr>
-              <w:t xml:space="preserve">C  —  ANYTHING TOMORROW'S TEAM NEEDS TO KNOW</w:t>
-            </w:r>
-          </w:p>
-        </w:tc>
-      </w:tr>
-    </w:tbl>
-    <w:p>
-      <w:pPr>
-        <w:spacing w:after="120" w:before="0"/>
-      </w:pPr>
-    </w:p>
-    <w:tbl>
-      <w:tblPr>
-        <w:tblW w:type="dxa" w:w="10626"/>
-        <w:tblBorders>
-          <w:top w:val="none" w:color="auto" w:sz="0"/>
-          <w:left w:val="none" w:color="auto" w:sz="0"/>
-          <w:bottom w:val="none" w:color="auto" w:sz="0"/>
-          <w:right w:val="none" w:color="auto" w:sz="0"/>
-          <w:insideH w:val="single" w:color="auto" w:sz="4"/>
-          <w:insideV w:val="single" w:color="auto" w:sz="4"/>
-        </w:tblBorders>
-      </w:tblPr>
-      <w:tblGrid>
-        <w:gridCol w:w="10626"/>
-      </w:tblGrid>
-      <w:tr>
-        <w:tc>
-          <w:tcPr>
-            <w:tcW w:type="dxa" w:w="10626"/>
-            <w:tcBorders>
-              <w:top w:val="none" w:color="auto" w:sz="0"/>
-              <w:left w:val="none" w:color="auto" w:sz="0"/>
-              <w:bottom w:val="none" w:color="auto" w:sz="0"/>
-              <w:right w:val="none" w:color="auto" w:sz="0"/>
-            </w:tcBorders>
-            <w:tcMar>
-              <w:top w:type="dxa" w:w="0"/>
-              <w:left w:type="dxa" w:w="60"/>
-              <w:bottom w:type="dxa" w:w="0"/>
-              <w:right w:type="dxa" w:w="60"/>
-            </w:tcMar>
-          </w:tcPr>
-          <w:p>
-            <w:pPr>
-              <w:spacing w:after="20" w:before="0"/>
-            </w:pPr>
-            <w:r>
-              <w:rPr>
-                <w:rFonts w:ascii="Calibri" w:cs="Calibri" w:eastAsia="Calibri" w:hAnsi="Calibri"/>
-                <w:b/>
-                <w:bCs/>
-                <w:color w:val="7F7F7F"/>
-                <w:sz w:val="16"/>
-                <w:szCs w:val="16"/>
-              </w:rPr>
-              <w:t xml:space="preserve">Context, risks, decisions needed — anything that affects how tomorrow starts</w:t>
-            </w:r>
-          </w:p>
-          <w:tbl>
-            <w:tblPr>
-              <w:tblW w:type="dxa" w:w="10506"/>
-              <w:tblBorders>
-                <w:top w:val="single" w:color="auto" w:sz="4"/>
-                <w:left w:val="single" w:color="auto" w:sz="4"/>
-                <w:bottom w:val="single" w:color="auto" w:sz="4"/>
-                <w:right w:val="single" w:color="auto" w:sz="4"/>
-                <w:insideH w:val="single" w:color="auto" w:sz="4"/>
-                <w:insideV w:val="single" w:color="auto" w:sz="4"/>
-              </w:tblBorders>
-            </w:tblPr>
-            <w:tblGrid>
-              <w:gridCol w:w="10506"/>
-            </w:tblGrid>
-            <w:tr>
-              <w:tc>
-                <w:tcPr>
-                  <w:tcW w:type="dxa" w:w="10506"/>
-                  <w:tcBorders>
-                    <w:top w:val="single" w:color="C0CCDA" w:sz="4"/>
-                    <w:left w:val="single" w:color="C0CCDA" w:sz="4"/>
-                    <w:bottom w:val="single" w:color="C0CCDA" w:sz="4"/>
-                    <w:right w:val="single" w:color="C0CCDA" w:sz="4"/>
-                  </w:tcBorders>
-                  <w:shd w:fill="FFFFFF" w:color="auto" w:val="clear"/>
-                  <w:tcMar>
-                    <w:top w:type="dxa" w:w="40"/>
-                    <w:left w:type="dxa" w:w="80"/>
-                    <w:bottom w:type="dxa" w:w="40"/>
-                    <w:right w:type="dxa" w:w="80"/>
-                  </w:tcMar>
-                </w:tcPr>
-                <w:p>
-                  <w:r>
-                    <w:rPr>
-                      <w:rFonts w:ascii="Calibri" w:cs="Calibri" w:eastAsia="Calibri" w:hAnsi="Calibri"/>
-                      <w:sz w:val="22"/>
-                      <w:szCs w:val="22"/>
-                    </w:rPr>
-                    <w:t xml:space="preserve"> </w:t>
-                  </w:r>
-                </w:p>
-              </w:tc>
-            </w:tr>
-          </w:tbl>
-          <w:p/>
-        </w:tc>
-      </w:tr>
-    </w:tbl>
-    <w:p>
-      <w:pPr>
-        <w:spacing w:after="160" w:before="0"/>
-      </w:pPr>
-    </w:p>
-    <w:tbl>
-      <w:tblPr>
-        <w:tblW w:type="dxa" w:w="10626"/>
-        <w:tblBorders>
-          <w:top w:val="none" w:color="auto" w:sz="0"/>
-          <w:left w:val="none" w:color="auto" w:sz="0"/>
-          <w:bottom w:val="none" w:color="auto" w:sz="0"/>
-          <w:right w:val="none" w:color="auto" w:sz="0"/>
-          <w:insideH w:val="single" w:color="auto" w:sz="4"/>
-          <w:insideV w:val="single" w:color="auto" w:sz="4"/>
-        </w:tblBorders>
-      </w:tblPr>
-      <w:tblGrid>
-        <w:gridCol w:w="10626"/>
-      </w:tblGrid>
-      <w:tr>
-        <w:tc>
-          <w:tcPr>
-            <w:tcW w:type="dxa" w:w="10626"/>
-            <w:shd w:fill="1F3964" w:color="auto" w:val="clear"/>
-            <w:tcMar>
-              <w:top w:type="dxa" w:w="80"/>
-              <w:left w:type="dxa" w:w="240"/>
-              <w:bottom w:type="dxa" w:w="80"/>
-              <w:right w:type="dxa" w:w="240"/>
-            </w:tcMar>
-          </w:tcPr>
-          <w:p>
-            <w:pPr>
-              <w:jc w:val="center"/>
-            </w:pPr>
-            <w:r>
-              <w:rPr>
-                <w:rFonts w:ascii="Calibri" w:cs="Calibri" w:eastAsia="Calibri" w:hAnsi="Calibri"/>
-                <w:i/>
-                <w:iCs/>
-                <w:color w:val="AABBCC"/>
-                <w:sz w:val="17"/>
-                <w:szCs w:val="17"/>
-              </w:rPr>
-              <w:t xml:space="preserve">Fill this page before you leave  ·  </w:t>
-            </w:r>
-            <w:r>
-              <w:rPr>
-                <w:rFonts w:ascii="Calibri" w:cs="Calibri" w:eastAsia="Calibri" w:hAnsi="Calibri"/>
-                <w:i/>
-                <w:iCs/>
-                <w:color w:val="FFC000"/>
-                <w:sz w:val="17"/>
-                <w:szCs w:val="17"/>
-              </w:rPr>
-              <w:t xml:space="preserve">Tomorrow's supervisor reviews this first thing</w:t>
-            </w:r>
-          </w:p>
-        </w:tc>
-      </w:tr>
-    </w:tbl>
-    <w:p>
-      <w:r>
-        <w:br w:type="page"/>
-      </w:r>
-    </w:p>
-    <w:tbl>
-      <w:tblPr>
-        <w:tblW w:type="dxa" w:w="10626"/>
-        <w:tblBorders>
-          <w:top w:val="none" w:color="auto" w:sz="0"/>
-          <w:left w:val="none" w:color="auto" w:sz="0"/>
-          <w:bottom w:val="none" w:color="auto" w:sz="0"/>
-          <w:right w:val="none" w:color="auto" w:sz="0"/>
-          <w:insideH w:val="single" w:color="auto" w:sz="4"/>
-          <w:insideV w:val="single" w:color="auto" w:sz="4"/>
-        </w:tblBorders>
-      </w:tblPr>
-      <w:tblGrid>
-        <w:gridCol w:w="7826"/>
-        <w:gridCol w:w="2800"/>
-      </w:tblGrid>
-      <w:tr>
-        <w:tc>
-          <w:tcPr>
-            <w:tcW w:type="dxa" w:w="7826"/>
-            <w:shd w:fill="1F3964" w:color="auto" w:val="clear"/>
-            <w:tcMar>
-              <w:top w:type="dxa" w:w="140"/>
-              <w:left w:type="dxa" w:w="240"/>
-              <w:bottom w:type="dxa" w:w="140"/>
-              <w:right w:type="dxa" w:w="120"/>
-            </w:tcMar>
-          </w:tcPr>
-          <w:p>
-            <w:r>
-              <w:rPr>
-                <w:rFonts w:ascii="Calibri" w:cs="Calibri" w:eastAsia="Calibri" w:hAnsi="Calibri"/>
-                <w:b/>
-                <w:bCs/>
-                <w:color w:val="FFFFFF"/>
-                <w:sz w:val="40"/>
-                <w:szCs w:val="40"/>
-              </w:rPr>
-              <w:t xml:space="preserve">Tomorrow's Priorities</w:t>
-            </w:r>
-          </w:p>
-          <w:p>
-            <w:pPr>
-              <w:spacing w:after="0" w:before="40"/>
-            </w:pPr>
-            <w:r>
-              <w:rPr>
-                <w:rFonts w:ascii="Calibri" w:cs="Calibri" w:eastAsia="Calibri" w:hAnsi="Calibri"/>
-                <w:color w:val="AABBCC"/>
-                <w:sz w:val="17"/>
-                <w:szCs w:val="17"/>
-              </w:rPr>
-              <w:t xml:space="preserve">Complete at end of today  ·  Execute tomorrow</w:t>
-            </w:r>
-          </w:p>
-        </w:tc>
-        <w:tc>
-          <w:tcPr>
-            <w:tcW w:type="dxa" w:w="2800"/>
-            <w:shd w:fill="4B2D8B" w:color="auto" w:val="clear"/>
-            <w:tcMar>
-              <w:top w:type="dxa" w:w="100"/>
-              <w:left w:type="dxa" w:w="160"/>
-              <w:bottom w:type="dxa" w:w="100"/>
-              <w:right w:type="dxa" w:w="160"/>
-            </w:tcMar>
-            <w:vAlign w:val="center"/>
-          </w:tcPr>
-          <w:p>
-            <w:pPr>
-              <w:jc w:val="center"/>
-            </w:pPr>
-            <w:r>
-              <w:rPr>
-                <w:rFonts w:ascii="Calibri" w:cs="Calibri" w:eastAsia="Calibri" w:hAnsi="Calibri"/>
-                <w:b/>
-                <w:bCs/>
-                <w:color w:val="1F3964"/>
-                <w:sz w:val="20"/>
-                <w:szCs w:val="20"/>
-              </w:rPr>
-              <w:t xml:space="preserve">PAGE 3</w:t>
-            </w:r>
-          </w:p>
-          <w:p>
-            <w:pPr>
-              <w:spacing w:after="0" w:before="10"/>
-              <w:jc w:val="center"/>
-            </w:pPr>
-            <w:r>
-              <w:rPr>
-                <w:rFonts w:ascii="Calibri" w:cs="Calibri" w:eastAsia="Calibri" w:hAnsi="Calibri"/>
-                <w:color w:val="1F3964"/>
-                <w:sz w:val="14"/>
-                <w:szCs w:val="14"/>
-              </w:rPr>
-              <w:t xml:space="preserve">Plan to Succeed</w:t>
-            </w:r>
-          </w:p>
-        </w:tc>
-      </w:tr>
-    </w:tbl>
-    <w:p>
-      <w:pPr>
-        <w:spacing w:after="120" w:before="0"/>
-      </w:pPr>
-    </w:p>
-    <w:p>
-      <w:r>
-        <w:rPr>
-          <w:rFonts w:ascii="Calibri" w:cs="Calibri" w:eastAsia="Calibri" w:hAnsi="Calibri"/>
-          <w:b/>
-          <w:bCs/>
-          <w:color w:val="7F7F7F"/>
-          <w:sz w:val="16"/>
-          <w:szCs w:val="16"/>
-        </w:rPr>
-        <w:t xml:space="preserve">TOMORROW'S DATE</w:t>
-      </w:r>
-    </w:p>
-    <w:p>
-      <w:pPr>
-        <w:spacing w:after="40" w:before="0"/>
-      </w:pPr>
-    </w:p>
-    <w:tbl>
-      <w:tblPr>
-        <w:tblW w:type="dxa" w:w="10626"/>
-        <w:tblBorders>
-          <w:top w:val="none" w:color="auto" w:sz="0"/>
-          <w:left w:val="none" w:color="auto" w:sz="0"/>
-          <w:bottom w:val="none" w:color="auto" w:sz="0"/>
-          <w:right w:val="none" w:color="auto" w:sz="0"/>
-          <w:insideH w:val="single" w:color="auto" w:sz="4"/>
-          <w:insideV w:val="single" w:color="auto" w:sz="4"/>
-        </w:tblBorders>
-      </w:tblPr>
-      <w:tblGrid>
-        <w:gridCol w:w="280"/>
-        <w:gridCol w:w="280"/>
-        <w:gridCol w:w="140"/>
-        <w:gridCol w:w="280"/>
-        <w:gridCol w:w="280"/>
-        <w:gridCol w:w="140"/>
-        <w:gridCol w:w="280"/>
-        <w:gridCol w:w="280"/>
-        <w:gridCol w:w="280"/>
-        <w:gridCol w:w="280"/>
-        <w:gridCol w:w="300"/>
-        <w:gridCol w:w="7806"/>
-      </w:tblGrid>
-      <w:tr>
-        <w:tc>
-          <w:tcPr>
-            <w:tcW w:type="dxa" w:w="280"/>
-            <w:tcBorders>
-              <w:top w:val="none" w:color="auto" w:sz="0"/>
-              <w:left w:val="none" w:color="auto" w:sz="0"/>
-              <w:bottom w:val="none" w:color="auto" w:sz="0"/>
-              <w:right w:val="none" w:color="auto" w:sz="0"/>
-            </w:tcBorders>
-            <w:tcMar>
-              <w:top w:type="dxa" w:w="0"/>
-              <w:left w:type="dxa" w:w="20"/>
-              <w:bottom w:type="dxa" w:w="0"/>
-              <w:right w:type="dxa" w:w="20"/>
-            </w:tcMar>
-          </w:tcPr>
-          <w:p>
-            <w:pPr>
-              <w:spacing w:after="20" w:before="0"/>
-              <w:jc w:val="center"/>
-            </w:pPr>
-            <w:r>
-              <w:rPr>
-                <w:rFonts w:ascii="Calibri" w:cs="Calibri" w:eastAsia="Calibri" w:hAnsi="Calibri"/>
-                <w:color w:val="7F7F7F"/>
-                <w:sz w:val="14"/>
-                <w:szCs w:val="14"/>
-              </w:rPr>
-              <w:t xml:space="preserve">D</w:t>
-            </w:r>
-          </w:p>
-          <w:tbl>
-            <w:tblPr>
-              <w:tblW w:type="dxa" w:w="240"/>
-              <w:tblBorders>
-                <w:top w:val="single" w:color="auto" w:sz="4"/>
-                <w:left w:val="single" w:color="auto" w:sz="4"/>
-                <w:bottom w:val="single" w:color="auto" w:sz="4"/>
-                <w:right w:val="single" w:color="auto" w:sz="4"/>
-                <w:insideH w:val="single" w:color="auto" w:sz="4"/>
-                <w:insideV w:val="single" w:color="auto" w:sz="4"/>
-              </w:tblBorders>
-            </w:tblPr>
-            <w:tblGrid>
-              <w:gridCol w:w="240"/>
-            </w:tblGrid>
-            <w:tr>
-              <w:tc>
-                <w:tcPr>
-                  <w:tcW w:type="dxa" w:w="240"/>
-                  <w:tcBorders>
-                    <w:top w:val="single" w:color="1F3964" w:sz="14"/>
-                    <w:left w:val="single" w:color="1F3964" w:sz="14"/>
-                    <w:bottom w:val="single" w:color="1F3964" w:sz="14"/>
-                    <w:right w:val="single" w:color="1F3964" w:sz="14"/>
-                  </w:tcBorders>
-                  <w:shd w:fill="FFFFFF" w:color="auto" w:val="clear"/>
-                  <w:tcMar>
-                    <w:top w:type="dxa" w:w="40"/>
-                    <w:left w:type="dxa" w:w="40"/>
-                    <w:bottom w:type="dxa" w:w="40"/>
-                    <w:right w:type="dxa" w:w="40"/>
-                  </w:tcMar>
-                </w:tcPr>
-                <w:p>
-                  <w:pPr>
-                    <w:jc w:val="center"/>
-                  </w:pPr>
-                  <w:r>
-                    <w:rPr>
-                      <w:rFonts w:ascii="Calibri" w:cs="Calibri" w:eastAsia="Calibri" w:hAnsi="Calibri"/>
-                      <w:sz w:val="36"/>
-                      <w:szCs w:val="36"/>
-                    </w:rPr>
-                    <w:t xml:space="preserve"> </w:t>
-                  </w:r>
-                </w:p>
-              </w:tc>
-            </w:tr>
-          </w:tbl>
-          <w:p/>
-        </w:tc>
-        <w:tc>
-          <w:tcPr>
-            <w:tcW w:type="dxa" w:w="280"/>
-            <w:tcBorders>
-              <w:top w:val="none" w:color="auto" w:sz="0"/>
-              <w:left w:val="none" w:color="auto" w:sz="0"/>
-              <w:bottom w:val="none" w:color="auto" w:sz="0"/>
-              <w:right w:val="none" w:color="auto" w:sz="0"/>
-            </w:tcBorders>
-            <w:tcMar>
-              <w:top w:type="dxa" w:w="0"/>
-              <w:left w:type="dxa" w:w="20"/>
-              <w:bottom w:type="dxa" w:w="0"/>
-              <w:right w:type="dxa" w:w="20"/>
-            </w:tcMar>
-          </w:tcPr>
-          <w:p>
-            <w:pPr>
-              <w:spacing w:after="20" w:before="0"/>
-              <w:jc w:val="center"/>
-            </w:pPr>
-            <w:r>
-              <w:rPr>
-                <w:rFonts w:ascii="Calibri" w:cs="Calibri" w:eastAsia="Calibri" w:hAnsi="Calibri"/>
-                <w:color w:val="7F7F7F"/>
-                <w:sz w:val="14"/>
-                <w:szCs w:val="14"/>
-              </w:rPr>
-              <w:t xml:space="preserve">D</w:t>
-            </w:r>
-          </w:p>
-          <w:tbl>
-            <w:tblPr>
-              <w:tblW w:type="dxa" w:w="240"/>
-              <w:tblBorders>
-                <w:top w:val="single" w:color="auto" w:sz="4"/>
-                <w:left w:val="single" w:color="auto" w:sz="4"/>
-                <w:bottom w:val="single" w:color="auto" w:sz="4"/>
-                <w:right w:val="single" w:color="auto" w:sz="4"/>
-                <w:insideH w:val="single" w:color="auto" w:sz="4"/>
-                <w:insideV w:val="single" w:color="auto" w:sz="4"/>
-              </w:tblBorders>
-            </w:tblPr>
-            <w:tblGrid>
-              <w:gridCol w:w="240"/>
-            </w:tblGrid>
-            <w:tr>
-              <w:tc>
-                <w:tcPr>
-                  <w:tcW w:type="dxa" w:w="240"/>
-                  <w:tcBorders>
-                    <w:top w:val="single" w:color="1F3964" w:sz="14"/>
-                    <w:left w:val="single" w:color="1F3964" w:sz="14"/>
-                    <w:bottom w:val="single" w:color="1F3964" w:sz="14"/>
-                    <w:right w:val="single" w:color="1F3964" w:sz="14"/>
-                  </w:tcBorders>
-                  <w:shd w:fill="FFFFFF" w:color="auto" w:val="clear"/>
-                  <w:tcMar>
-                    <w:top w:type="dxa" w:w="40"/>
-                    <w:left w:type="dxa" w:w="40"/>
-                    <w:bottom w:type="dxa" w:w="40"/>
-                    <w:right w:type="dxa" w:w="40"/>
-                  </w:tcMar>
-                </w:tcPr>
-                <w:p>
-                  <w:pPr>
-                    <w:jc w:val="center"/>
-                  </w:pPr>
-                  <w:r>
-                    <w:rPr>
-                      <w:rFonts w:ascii="Calibri" w:cs="Calibri" w:eastAsia="Calibri" w:hAnsi="Calibri"/>
-                      <w:sz w:val="36"/>
-                      <w:szCs w:val="36"/>
-                    </w:rPr>
-                    <w:t xml:space="preserve"> </w:t>
-                  </w:r>
-                </w:p>
-              </w:tc>
-            </w:tr>
-          </w:tbl>
-          <w:p/>
-        </w:tc>
-        <w:tc>
-          <w:tcPr>
-            <w:tcW w:type="dxa" w:w="140"/>
-            <w:tcBorders>
-              <w:top w:val="none" w:color="auto" w:sz="0"/>
-              <w:left w:val="none" w:color="auto" w:sz="0"/>
-              <w:bottom w:val="none" w:color="auto" w:sz="0"/>
-              <w:right w:val="none" w:color="auto" w:sz="0"/>
-            </w:tcBorders>
-            <w:tcMar>
-              <w:top w:type="dxa" w:w="0"/>
-              <w:left w:type="dxa" w:w="0"/>
-              <w:bottom w:type="dxa" w:w="0"/>
-              <w:right w:type="dxa" w:w="0"/>
-            </w:tcMar>
-            <w:vAlign w:val="center"/>
-          </w:tcPr>
-          <w:p>
-            <w:pPr>
-              <w:spacing w:after="0" w:before="40"/>
-              <w:jc w:val="center"/>
-            </w:pPr>
-            <w:r>
-              <w:rPr>
-                <w:rFonts w:ascii="Calibri" w:cs="Calibri" w:eastAsia="Calibri" w:hAnsi="Calibri"/>
-                <w:b/>
-                <w:bCs/>
-                <w:color w:val="7F7F7F"/>
-                <w:sz w:val="36"/>
-                <w:szCs w:val="36"/>
-              </w:rPr>
-              <w:t xml:space="preserve">/</w:t>
-            </w:r>
-          </w:p>
-        </w:tc>
-        <w:tc>
-          <w:tcPr>
-            <w:tcW w:type="dxa" w:w="280"/>
-            <w:tcBorders>
-              <w:top w:val="none" w:color="auto" w:sz="0"/>
-              <w:left w:val="none" w:color="auto" w:sz="0"/>
-              <w:bottom w:val="none" w:color="auto" w:sz="0"/>
-              <w:right w:val="none" w:color="auto" w:sz="0"/>
-            </w:tcBorders>
-            <w:tcMar>
-              <w:top w:type="dxa" w:w="0"/>
-              <w:left w:type="dxa" w:w="20"/>
-              <w:bottom w:type="dxa" w:w="0"/>
-              <w:right w:type="dxa" w:w="20"/>
-            </w:tcMar>
-          </w:tcPr>
-          <w:p>
-            <w:pPr>
-              <w:spacing w:after="20" w:before="0"/>
-              <w:jc w:val="center"/>
-            </w:pPr>
-            <w:r>
-              <w:rPr>
-                <w:rFonts w:ascii="Calibri" w:cs="Calibri" w:eastAsia="Calibri" w:hAnsi="Calibri"/>
-                <w:color w:val="7F7F7F"/>
-                <w:sz w:val="14"/>
-                <w:szCs w:val="14"/>
-              </w:rPr>
-              <w:t xml:space="preserve">M</w:t>
-            </w:r>
-          </w:p>
-          <w:tbl>
-            <w:tblPr>
-              <w:tblW w:type="dxa" w:w="240"/>
-              <w:tblBorders>
-                <w:top w:val="single" w:color="auto" w:sz="4"/>
-                <w:left w:val="single" w:color="auto" w:sz="4"/>
-                <w:bottom w:val="single" w:color="auto" w:sz="4"/>
-                <w:right w:val="single" w:color="auto" w:sz="4"/>
-                <w:insideH w:val="single" w:color="auto" w:sz="4"/>
-                <w:insideV w:val="single" w:color="auto" w:sz="4"/>
-              </w:tblBorders>
-            </w:tblPr>
-            <w:tblGrid>
-              <w:gridCol w:w="240"/>
-            </w:tblGrid>
-            <w:tr>
-              <w:tc>
-                <w:tcPr>
-                  <w:tcW w:type="dxa" w:w="240"/>
-                  <w:tcBorders>
-                    <w:top w:val="single" w:color="1F3964" w:sz="14"/>
-                    <w:left w:val="single" w:color="1F3964" w:sz="14"/>
-                    <w:bottom w:val="single" w:color="1F3964" w:sz="14"/>
-                    <w:right w:val="single" w:color="1F3964" w:sz="14"/>
-                  </w:tcBorders>
-                  <w:shd w:fill="FFFFFF" w:color="auto" w:val="clear"/>
-                  <w:tcMar>
-                    <w:top w:type="dxa" w:w="40"/>
-                    <w:left w:type="dxa" w:w="40"/>
-                    <w:bottom w:type="dxa" w:w="40"/>
-                    <w:right w:type="dxa" w:w="40"/>
-                  </w:tcMar>
-                </w:tcPr>
-                <w:p>
-                  <w:pPr>
-                    <w:jc w:val="center"/>
-                  </w:pPr>
-                  <w:r>
-                    <w:rPr>
-                      <w:rFonts w:ascii="Calibri" w:cs="Calibri" w:eastAsia="Calibri" w:hAnsi="Calibri"/>
-                      <w:sz w:val="36"/>
-                      <w:szCs w:val="36"/>
-                    </w:rPr>
-                    <w:t xml:space="preserve"> </w:t>
-                  </w:r>
-                </w:p>
-              </w:tc>
-            </w:tr>
-          </w:tbl>
-          <w:p/>
-        </w:tc>
-        <w:tc>
-          <w:tcPr>
-            <w:tcW w:type="dxa" w:w="280"/>
-            <w:tcBorders>
-              <w:top w:val="none" w:color="auto" w:sz="0"/>
-              <w:left w:val="none" w:color="auto" w:sz="0"/>
-              <w:bottom w:val="none" w:color="auto" w:sz="0"/>
-              <w:right w:val="none" w:color="auto" w:sz="0"/>
-            </w:tcBorders>
-            <w:tcMar>
-              <w:top w:type="dxa" w:w="0"/>
-              <w:left w:type="dxa" w:w="20"/>
-              <w:bottom w:type="dxa" w:w="0"/>
-              <w:right w:type="dxa" w:w="20"/>
-            </w:tcMar>
-          </w:tcPr>
-          <w:p>
-            <w:pPr>
-              <w:spacing w:after="20" w:before="0"/>
-              <w:jc w:val="center"/>
-            </w:pPr>
-            <w:r>
-              <w:rPr>
-                <w:rFonts w:ascii="Calibri" w:cs="Calibri" w:eastAsia="Calibri" w:hAnsi="Calibri"/>
-                <w:color w:val="7F7F7F"/>
-                <w:sz w:val="14"/>
-                <w:szCs w:val="14"/>
-              </w:rPr>
-              <w:t xml:space="preserve">M</w:t>
-            </w:r>
-          </w:p>
-          <w:tbl>
-            <w:tblPr>
-              <w:tblW w:type="dxa" w:w="240"/>
-              <w:tblBorders>
-                <w:top w:val="single" w:color="auto" w:sz="4"/>
-                <w:left w:val="single" w:color="auto" w:sz="4"/>
-                <w:bottom w:val="single" w:color="auto" w:sz="4"/>
-                <w:right w:val="single" w:color="auto" w:sz="4"/>
-                <w:insideH w:val="single" w:color="auto" w:sz="4"/>
-                <w:insideV w:val="single" w:color="auto" w:sz="4"/>
-              </w:tblBorders>
-            </w:tblPr>
-            <w:tblGrid>
-              <w:gridCol w:w="240"/>
-            </w:tblGrid>
-            <w:tr>
-              <w:tc>
-                <w:tcPr>
-                  <w:tcW w:type="dxa" w:w="240"/>
-                  <w:tcBorders>
-                    <w:top w:val="single" w:color="1F3964" w:sz="14"/>
-                    <w:left w:val="single" w:color="1F3964" w:sz="14"/>
-                    <w:bottom w:val="single" w:color="1F3964" w:sz="14"/>
-                    <w:right w:val="single" w:color="1F3964" w:sz="14"/>
-                  </w:tcBorders>
-                  <w:shd w:fill="FFFFFF" w:color="auto" w:val="clear"/>
-                  <w:tcMar>
-                    <w:top w:type="dxa" w:w="40"/>
-                    <w:left w:type="dxa" w:w="40"/>
-                    <w:bottom w:type="dxa" w:w="40"/>
-                    <w:right w:type="dxa" w:w="40"/>
-                  </w:tcMar>
-                </w:tcPr>
-                <w:p>
-                  <w:pPr>
-                    <w:jc w:val="center"/>
-                  </w:pPr>
-                  <w:r>
-                    <w:rPr>
-                      <w:rFonts w:ascii="Calibri" w:cs="Calibri" w:eastAsia="Calibri" w:hAnsi="Calibri"/>
-                      <w:sz w:val="36"/>
-                      <w:szCs w:val="36"/>
-                    </w:rPr>
-                    <w:t xml:space="preserve"> </w:t>
-                  </w:r>
-                </w:p>
-              </w:tc>
-            </w:tr>
-          </w:tbl>
-          <w:p/>
-        </w:tc>
-        <w:tc>
-          <w:tcPr>
-            <w:tcW w:type="dxa" w:w="140"/>
-            <w:tcBorders>
-              <w:top w:val="none" w:color="auto" w:sz="0"/>
-              <w:left w:val="none" w:color="auto" w:sz="0"/>
-              <w:bottom w:val="none" w:color="auto" w:sz="0"/>
-              <w:right w:val="none" w:color="auto" w:sz="0"/>
-            </w:tcBorders>
-            <w:tcMar>
-              <w:top w:type="dxa" w:w="0"/>
-              <w:left w:type="dxa" w:w="0"/>
-              <w:bottom w:type="dxa" w:w="0"/>
-              <w:right w:type="dxa" w:w="0"/>
-            </w:tcMar>
-            <w:vAlign w:val="center"/>
-          </w:tcPr>
-          <w:p>
-            <w:pPr>
-              <w:spacing w:after="0" w:before="40"/>
-              <w:jc w:val="center"/>
-            </w:pPr>
-            <w:r>
-              <w:rPr>
-                <w:rFonts w:ascii="Calibri" w:cs="Calibri" w:eastAsia="Calibri" w:hAnsi="Calibri"/>
-                <w:b/>
-                <w:bCs/>
-                <w:color w:val="7F7F7F"/>
-                <w:sz w:val="36"/>
-                <w:szCs w:val="36"/>
-              </w:rPr>
-              <w:t xml:space="preserve">/</w:t>
-            </w:r>
-          </w:p>
-        </w:tc>
-        <w:tc>
-          <w:tcPr>
-            <w:tcW w:type="dxa" w:w="280"/>
-            <w:tcBorders>
-              <w:top w:val="none" w:color="auto" w:sz="0"/>
-              <w:left w:val="none" w:color="auto" w:sz="0"/>
-              <w:bottom w:val="none" w:color="auto" w:sz="0"/>
-              <w:right w:val="none" w:color="auto" w:sz="0"/>
-            </w:tcBorders>
-            <w:tcMar>
-              <w:top w:type="dxa" w:w="0"/>
-              <w:left w:type="dxa" w:w="20"/>
-              <w:bottom w:type="dxa" w:w="0"/>
-              <w:right w:type="dxa" w:w="20"/>
-            </w:tcMar>
-          </w:tcPr>
-          <w:p>
-            <w:pPr>
-              <w:spacing w:after="20" w:before="0"/>
-              <w:jc w:val="center"/>
-            </w:pPr>
-            <w:r>
-              <w:rPr>
-                <w:rFonts w:ascii="Calibri" w:cs="Calibri" w:eastAsia="Calibri" w:hAnsi="Calibri"/>
-                <w:color w:val="7F7F7F"/>
-                <w:sz w:val="14"/>
-                <w:szCs w:val="14"/>
-              </w:rPr>
-              <w:t xml:space="preserve">Y</w:t>
-            </w:r>
-          </w:p>
-          <w:tbl>
-            <w:tblPr>
-              <w:tblW w:type="dxa" w:w="240"/>
-              <w:tblBorders>
-                <w:top w:val="single" w:color="auto" w:sz="4"/>
-                <w:left w:val="single" w:color="auto" w:sz="4"/>
-                <w:bottom w:val="single" w:color="auto" w:sz="4"/>
-                <w:right w:val="single" w:color="auto" w:sz="4"/>
-                <w:insideH w:val="single" w:color="auto" w:sz="4"/>
-                <w:insideV w:val="single" w:color="auto" w:sz="4"/>
-              </w:tblBorders>
-            </w:tblPr>
-            <w:tblGrid>
-              <w:gridCol w:w="240"/>
-            </w:tblGrid>
-            <w:tr>
-              <w:tc>
-                <w:tcPr>
-                  <w:tcW w:type="dxa" w:w="240"/>
-                  <w:tcBorders>
-                    <w:top w:val="single" w:color="1F3964" w:sz="14"/>
-                    <w:left w:val="single" w:color="1F3964" w:sz="14"/>
-                    <w:bottom w:val="single" w:color="1F3964" w:sz="14"/>
-                    <w:right w:val="single" w:color="1F3964" w:sz="14"/>
-                  </w:tcBorders>
-                  <w:shd w:fill="FFFFFF" w:color="auto" w:val="clear"/>
-                  <w:tcMar>
-                    <w:top w:type="dxa" w:w="40"/>
-                    <w:left w:type="dxa" w:w="40"/>
-                    <w:bottom w:type="dxa" w:w="40"/>
-                    <w:right w:type="dxa" w:w="40"/>
-                  </w:tcMar>
-                </w:tcPr>
-                <w:p>
-                  <w:pPr>
-                    <w:jc w:val="center"/>
-                  </w:pPr>
-                  <w:r>
-                    <w:rPr>
-                      <w:rFonts w:ascii="Calibri" w:cs="Calibri" w:eastAsia="Calibri" w:hAnsi="Calibri"/>
-                      <w:sz w:val="36"/>
-                      <w:szCs w:val="36"/>
-                    </w:rPr>
-                    <w:t xml:space="preserve"> </w:t>
-                  </w:r>
-                </w:p>
-              </w:tc>
-            </w:tr>
-          </w:tbl>
-          <w:p/>
-        </w:tc>
-        <w:tc>
-          <w:tcPr>
-            <w:tcW w:type="dxa" w:w="280"/>
-            <w:tcBorders>
-              <w:top w:val="none" w:color="auto" w:sz="0"/>
-              <w:left w:val="none" w:color="auto" w:sz="0"/>
-              <w:bottom w:val="none" w:color="auto" w:sz="0"/>
-              <w:right w:val="none" w:color="auto" w:sz="0"/>
-            </w:tcBorders>
-            <w:tcMar>
-              <w:top w:type="dxa" w:w="0"/>
-              <w:left w:type="dxa" w:w="20"/>
-              <w:bottom w:type="dxa" w:w="0"/>
-              <w:right w:type="dxa" w:w="20"/>
-            </w:tcMar>
-          </w:tcPr>
-          <w:p>
-            <w:pPr>
-              <w:spacing w:after="20" w:before="0"/>
-              <w:jc w:val="center"/>
-            </w:pPr>
-            <w:r>
-              <w:rPr>
-                <w:rFonts w:ascii="Calibri" w:cs="Calibri" w:eastAsia="Calibri" w:hAnsi="Calibri"/>
-                <w:color w:val="7F7F7F"/>
-                <w:sz w:val="14"/>
-                <w:szCs w:val="14"/>
-              </w:rPr>
-              <w:t xml:space="preserve">Y</w:t>
-            </w:r>
-          </w:p>
-          <w:tbl>
-            <w:tblPr>
-              <w:tblW w:type="dxa" w:w="240"/>
-              <w:tblBorders>
-                <w:top w:val="single" w:color="auto" w:sz="4"/>
-                <w:left w:val="single" w:color="auto" w:sz="4"/>
-                <w:bottom w:val="single" w:color="auto" w:sz="4"/>
-                <w:right w:val="single" w:color="auto" w:sz="4"/>
-                <w:insideH w:val="single" w:color="auto" w:sz="4"/>
-                <w:insideV w:val="single" w:color="auto" w:sz="4"/>
-              </w:tblBorders>
-            </w:tblPr>
-            <w:tblGrid>
-              <w:gridCol w:w="240"/>
-            </w:tblGrid>
-            <w:tr>
-              <w:tc>
-                <w:tcPr>
-                  <w:tcW w:type="dxa" w:w="240"/>
-                  <w:tcBorders>
-                    <w:top w:val="single" w:color="1F3964" w:sz="14"/>
-                    <w:left w:val="single" w:color="1F3964" w:sz="14"/>
-                    <w:bottom w:val="single" w:color="1F3964" w:sz="14"/>
-                    <w:right w:val="single" w:color="1F3964" w:sz="14"/>
-                  </w:tcBorders>
-                  <w:shd w:fill="FFFFFF" w:color="auto" w:val="clear"/>
-                  <w:tcMar>
-                    <w:top w:type="dxa" w:w="40"/>
-                    <w:left w:type="dxa" w:w="40"/>
-                    <w:bottom w:type="dxa" w:w="40"/>
-                    <w:right w:type="dxa" w:w="40"/>
-                  </w:tcMar>
-                </w:tcPr>
-                <w:p>
-                  <w:pPr>
-                    <w:jc w:val="center"/>
-                  </w:pPr>
-                  <w:r>
-                    <w:rPr>
-                      <w:rFonts w:ascii="Calibri" w:cs="Calibri" w:eastAsia="Calibri" w:hAnsi="Calibri"/>
-                      <w:sz w:val="36"/>
-                      <w:szCs w:val="36"/>
-                    </w:rPr>
-                    <w:t xml:space="preserve"> </w:t>
-                  </w:r>
-                </w:p>
-              </w:tc>
-            </w:tr>
-          </w:tbl>
-          <w:p/>
-        </w:tc>
-        <w:tc>
-          <w:tcPr>
-            <w:tcW w:type="dxa" w:w="280"/>
-            <w:tcBorders>
-              <w:top w:val="none" w:color="auto" w:sz="0"/>
-              <w:left w:val="none" w:color="auto" w:sz="0"/>
-              <w:bottom w:val="none" w:color="auto" w:sz="0"/>
-              <w:right w:val="none" w:color="auto" w:sz="0"/>
-            </w:tcBorders>
-            <w:tcMar>
-              <w:top w:type="dxa" w:w="0"/>
-              <w:left w:type="dxa" w:w="20"/>
-              <w:bottom w:type="dxa" w:w="0"/>
-              <w:right w:type="dxa" w:w="20"/>
-            </w:tcMar>
-          </w:tcPr>
-          <w:p>
-            <w:pPr>
-              <w:spacing w:after="20" w:before="0"/>
-              <w:jc w:val="center"/>
-            </w:pPr>
-            <w:r>
-              <w:rPr>
-                <w:rFonts w:ascii="Calibri" w:cs="Calibri" w:eastAsia="Calibri" w:hAnsi="Calibri"/>
-                <w:color w:val="7F7F7F"/>
-                <w:sz w:val="14"/>
-                <w:szCs w:val="14"/>
-              </w:rPr>
-              <w:t xml:space="preserve">Y</w:t>
-            </w:r>
-          </w:p>
-          <w:tbl>
-            <w:tblPr>
-              <w:tblW w:type="dxa" w:w="240"/>
-              <w:tblBorders>
-                <w:top w:val="single" w:color="auto" w:sz="4"/>
-                <w:left w:val="single" w:color="auto" w:sz="4"/>
-                <w:bottom w:val="single" w:color="auto" w:sz="4"/>
-                <w:right w:val="single" w:color="auto" w:sz="4"/>
-                <w:insideH w:val="single" w:color="auto" w:sz="4"/>
-                <w:insideV w:val="single" w:color="auto" w:sz="4"/>
-              </w:tblBorders>
-            </w:tblPr>
-            <w:tblGrid>
-              <w:gridCol w:w="240"/>
-            </w:tblGrid>
-            <w:tr>
-              <w:tc>
-                <w:tcPr>
-                  <w:tcW w:type="dxa" w:w="240"/>
-                  <w:tcBorders>
-                    <w:top w:val="single" w:color="1F3964" w:sz="14"/>
-                    <w:left w:val="single" w:color="1F3964" w:sz="14"/>
-                    <w:bottom w:val="single" w:color="1F3964" w:sz="14"/>
-                    <w:right w:val="single" w:color="1F3964" w:sz="14"/>
-                  </w:tcBorders>
-                  <w:shd w:fill="FFFFFF" w:color="auto" w:val="clear"/>
-                  <w:tcMar>
-                    <w:top w:type="dxa" w:w="40"/>
-                    <w:left w:type="dxa" w:w="40"/>
-                    <w:bottom w:type="dxa" w:w="40"/>
-                    <w:right w:type="dxa" w:w="40"/>
-                  </w:tcMar>
-                </w:tcPr>
-                <w:p>
-                  <w:pPr>
-                    <w:jc w:val="center"/>
-                  </w:pPr>
-                  <w:r>
-                    <w:rPr>
-                      <w:rFonts w:ascii="Calibri" w:cs="Calibri" w:eastAsia="Calibri" w:hAnsi="Calibri"/>
-                      <w:sz w:val="36"/>
-                      <w:szCs w:val="36"/>
-                    </w:rPr>
-                    <w:t xml:space="preserve"> </w:t>
-                  </w:r>
-                </w:p>
-              </w:tc>
-            </w:tr>
-          </w:tbl>
-          <w:p/>
-        </w:tc>
-        <w:tc>
-          <w:tcPr>
-            <w:tcW w:type="dxa" w:w="280"/>
-            <w:tcBorders>
-              <w:top w:val="none" w:color="auto" w:sz="0"/>
-              <w:left w:val="none" w:color="auto" w:sz="0"/>
-              <w:bottom w:val="none" w:color="auto" w:sz="0"/>
-              <w:right w:val="none" w:color="auto" w:sz="0"/>
-            </w:tcBorders>
-            <w:tcMar>
-              <w:top w:type="dxa" w:w="0"/>
-              <w:left w:type="dxa" w:w="20"/>
-              <w:bottom w:type="dxa" w:w="0"/>
-              <w:right w:type="dxa" w:w="20"/>
-            </w:tcMar>
-          </w:tcPr>
-          <w:p>
-            <w:pPr>
-              <w:spacing w:after="20" w:before="0"/>
-              <w:jc w:val="center"/>
-            </w:pPr>
-            <w:r>
-              <w:rPr>
-                <w:rFonts w:ascii="Calibri" w:cs="Calibri" w:eastAsia="Calibri" w:hAnsi="Calibri"/>
-                <w:color w:val="7F7F7F"/>
-                <w:sz w:val="14"/>
-                <w:szCs w:val="14"/>
-              </w:rPr>
-              <w:t xml:space="preserve">Y</w:t>
-            </w:r>
-          </w:p>
-          <w:tbl>
-            <w:tblPr>
-              <w:tblW w:type="dxa" w:w="240"/>
-              <w:tblBorders>
-                <w:top w:val="single" w:color="auto" w:sz="4"/>
-                <w:left w:val="single" w:color="auto" w:sz="4"/>
-                <w:bottom w:val="single" w:color="auto" w:sz="4"/>
-                <w:right w:val="single" w:color="auto" w:sz="4"/>
-                <w:insideH w:val="single" w:color="auto" w:sz="4"/>
-                <w:insideV w:val="single" w:color="auto" w:sz="4"/>
-              </w:tblBorders>
-            </w:tblPr>
-            <w:tblGrid>
-              <w:gridCol w:w="240"/>
-            </w:tblGrid>
-            <w:tr>
-              <w:tc>
-                <w:tcPr>
-                  <w:tcW w:type="dxa" w:w="240"/>
-                  <w:tcBorders>
-                    <w:top w:val="single" w:color="1F3964" w:sz="14"/>
-                    <w:left w:val="single" w:color="1F3964" w:sz="14"/>
-                    <w:bottom w:val="single" w:color="1F3964" w:sz="14"/>
-                    <w:right w:val="single" w:color="1F3964" w:sz="14"/>
-                  </w:tcBorders>
-                  <w:shd w:fill="FFFFFF" w:color="auto" w:val="clear"/>
-                  <w:tcMar>
-                    <w:top w:type="dxa" w:w="40"/>
-                    <w:left w:type="dxa" w:w="40"/>
-                    <w:bottom w:type="dxa" w:w="40"/>
-                    <w:right w:type="dxa" w:w="40"/>
-                  </w:tcMar>
-                </w:tcPr>
-                <w:p>
-                  <w:pPr>
-                    <w:jc w:val="center"/>
-                  </w:pPr>
-                  <w:r>
-                    <w:rPr>
-                      <w:rFonts w:ascii="Calibri" w:cs="Calibri" w:eastAsia="Calibri" w:hAnsi="Calibri"/>
-                      <w:sz w:val="36"/>
-                      <w:szCs w:val="36"/>
-                    </w:rPr>
-                    <w:t xml:space="preserve"> </w:t>
-                  </w:r>
-                </w:p>
-              </w:tc>
-            </w:tr>
-          </w:tbl>
-          <w:p/>
-        </w:tc>
-        <w:tc>
-          <w:tcPr>
-            <w:tcW w:type="dxa" w:w="300"/>
-            <w:tcBorders>
-              <w:top w:val="none" w:color="auto" w:sz="0"/>
-              <w:left w:val="none" w:color="auto" w:sz="0"/>
-              <w:bottom w:val="none" w:color="auto" w:sz="0"/>
-              <w:right w:val="none" w:color="auto" w:sz="0"/>
-            </w:tcBorders>
-            <w:tcMar>
-              <w:top w:type="dxa" w:w="0"/>
-              <w:left w:type="dxa" w:w="0"/>
-              <w:bottom w:type="dxa" w:w="0"/>
-              <w:right w:type="dxa" w:w="0"/>
-            </w:tcMar>
-          </w:tcPr>
-          <w:p>
-            <w:r>
-              <w:rPr>
-                <w:rFonts w:ascii="Calibri" w:cs="Calibri" w:eastAsia="Calibri" w:hAnsi="Calibri"/>
-              </w:rPr>
-              <w:t xml:space="preserve"> </w:t>
-            </w:r>
-          </w:p>
-        </w:tc>
-        <w:tc>
-          <w:tcPr>
-            <w:tcW w:type="dxa" w:w="7806"/>
-            <w:tcBorders>
-              <w:top w:val="none" w:color="auto" w:sz="0"/>
-              <w:left w:val="none" w:color="auto" w:sz="0"/>
-              <w:bottom w:val="none" w:color="auto" w:sz="0"/>
-              <w:right w:val="none" w:color="auto" w:sz="0"/>
-            </w:tcBorders>
-            <w:tcMar>
-              <w:top w:type="dxa" w:w="0"/>
-              <w:left w:type="dxa" w:w="60"/>
-              <w:bottom w:type="dxa" w:w="0"/>
-              <w:right w:type="dxa" w:w="0"/>
-            </w:tcMar>
-          </w:tcPr>
-          <w:p>
-            <w:pPr>
-              <w:spacing w:after="20" w:before="0"/>
-            </w:pPr>
-            <w:r>
-              <w:rPr>
-                <w:rFonts w:ascii="Calibri" w:cs="Calibri" w:eastAsia="Calibri" w:hAnsi="Calibri"/>
-                <w:color w:val="7F7F7F"/>
-                <w:sz w:val="14"/>
-                <w:szCs w:val="14"/>
-              </w:rPr>
-              <w:t xml:space="preserve">SUPERVISOR NAME</w:t>
-            </w:r>
-          </w:p>
-          <w:tbl>
-            <w:tblPr>
-              <w:tblW w:type="dxa" w:w="7746"/>
-              <w:tblBorders>
-                <w:top w:val="single" w:color="auto" w:sz="4"/>
-                <w:left w:val="single" w:color="auto" w:sz="4"/>
-                <w:bottom w:val="single" w:color="auto" w:sz="4"/>
-                <w:right w:val="single" w:color="auto" w:sz="4"/>
-                <w:insideH w:val="single" w:color="auto" w:sz="4"/>
-                <w:insideV w:val="single" w:color="auto" w:sz="4"/>
-              </w:tblBorders>
-            </w:tblPr>
-            <w:tblGrid>
-              <w:gridCol w:w="7746"/>
-            </w:tblGrid>
-            <w:tr>
-              <w:tc>
-                <w:tcPr>
-                  <w:tcW w:type="dxa" w:w="7746"/>
-                  <w:tcBorders>
-                    <w:top w:val="single" w:color="1F3964" w:sz="14"/>
-                    <w:left w:val="single" w:color="1F3964" w:sz="14"/>
-                    <w:bottom w:val="single" w:color="1F3964" w:sz="14"/>
-                    <w:right w:val="single" w:color="1F3964" w:sz="14"/>
-                  </w:tcBorders>
-                  <w:shd w:fill="FFFFFF" w:color="auto" w:val="clear"/>
-                  <w:tcMar>
-                    <w:top w:type="dxa" w:w="40"/>
-                    <w:left w:type="dxa" w:w="80"/>
-                    <w:bottom w:type="dxa" w:w="40"/>
-                    <w:right w:type="dxa" w:w="40"/>
-                  </w:tcMar>
-                </w:tcPr>
-                <w:p>
-                  <w:r>
-                    <w:rPr>
-                      <w:rFonts w:ascii="Calibri" w:cs="Calibri" w:eastAsia="Calibri" w:hAnsi="Calibri"/>
-                      <w:sz w:val="36"/>
-                      <w:szCs w:val="36"/>
-                    </w:rPr>
-                    <w:t xml:space="preserve"> </w:t>
-                  </w:r>
-                </w:p>
-              </w:tc>
-            </w:tr>
-          </w:tbl>
-          <w:p/>
-        </w:tc>
-      </w:tr>
-    </w:tbl>
-    <w:p>
-      <w:pPr>
         <w:spacing w:after="160" w:before="0"/>
       </w:pPr>
     </w:p>
@@ -9171,7 +5314,7 @@
               <w:bottom w:val="none" w:color="auto" w:sz="0"/>
               <w:right w:val="single" w:color="1F3964" w:sz="8"/>
             </w:tcBorders>
-            <w:shd w:fill="1F3964" w:color="auto" w:val="clear"/>
+            <w:shd w:fill="F5F7FA" w:color="auto" w:val="clear"/>
             <w:tcMar>
               <w:top w:type="dxa" w:w="70"/>
               <w:left w:type="dxa" w:w="180"/>
@@ -9185,7 +5328,7 @@
                 <w:rFonts w:ascii="Calibri" w:cs="Calibri" w:eastAsia="Calibri" w:hAnsi="Calibri"/>
                 <w:b/>
                 <w:bCs/>
-                <w:color w:val="FFC000"/>
+                <w:color w:val="1F3964"/>
                 <w:sz w:val="20"/>
                 <w:szCs w:val="20"/>
               </w:rPr>
@@ -9196,7 +5339,7 @@
                 <w:rFonts w:ascii="Calibri" w:cs="Calibri" w:eastAsia="Calibri" w:hAnsi="Calibri"/>
                 <w:i/>
                 <w:iCs/>
-                <w:color w:val="AABBCC"/>
+                <w:color w:val="8899AA"/>
                 <w:sz w:val="18"/>
                 <w:szCs w:val="18"/>
               </w:rPr>
@@ -9687,7 +5830,7 @@
               <w:bottom w:val="none" w:color="auto" w:sz="0"/>
               <w:right w:val="single" w:color="1F3964" w:sz="8"/>
             </w:tcBorders>
-            <w:shd w:fill="1F3964" w:color="auto" w:val="clear"/>
+            <w:shd w:fill="F5F7FA" w:color="auto" w:val="clear"/>
             <w:tcMar>
               <w:top w:type="dxa" w:w="70"/>
               <w:left w:type="dxa" w:w="180"/>
@@ -9701,7 +5844,7 @@
                 <w:rFonts w:ascii="Calibri" w:cs="Calibri" w:eastAsia="Calibri" w:hAnsi="Calibri"/>
                 <w:b/>
                 <w:bCs/>
-                <w:color w:val="FFC000"/>
+                <w:color w:val="1F3964"/>
                 <w:sz w:val="20"/>
                 <w:szCs w:val="20"/>
               </w:rPr>
@@ -9712,7 +5855,7 @@
                 <w:rFonts w:ascii="Calibri" w:cs="Calibri" w:eastAsia="Calibri" w:hAnsi="Calibri"/>
                 <w:i/>
                 <w:iCs/>
-                <w:color w:val="AABBCC"/>
+                <w:color w:val="8899AA"/>
                 <w:sz w:val="18"/>
                 <w:szCs w:val="18"/>
               </w:rPr>
@@ -10203,7 +6346,7 @@
               <w:bottom w:val="none" w:color="auto" w:sz="0"/>
               <w:right w:val="single" w:color="1F3964" w:sz="8"/>
             </w:tcBorders>
-            <w:shd w:fill="1F3964" w:color="auto" w:val="clear"/>
+            <w:shd w:fill="F5F7FA" w:color="auto" w:val="clear"/>
             <w:tcMar>
               <w:top w:type="dxa" w:w="70"/>
               <w:left w:type="dxa" w:w="180"/>
@@ -10217,7 +6360,7 @@
                 <w:rFonts w:ascii="Calibri" w:cs="Calibri" w:eastAsia="Calibri" w:hAnsi="Calibri"/>
                 <w:b/>
                 <w:bCs/>
-                <w:color w:val="FFC000"/>
+                <w:color w:val="1F3964"/>
                 <w:sz w:val="20"/>
                 <w:szCs w:val="20"/>
               </w:rPr>
@@ -10228,7 +6371,7 @@
                 <w:rFonts w:ascii="Calibri" w:cs="Calibri" w:eastAsia="Calibri" w:hAnsi="Calibri"/>
                 <w:i/>
                 <w:iCs/>
-                <w:color w:val="AABBCC"/>
+                <w:color w:val="8899AA"/>
                 <w:sz w:val="18"/>
                 <w:szCs w:val="18"/>
               </w:rPr>
@@ -10719,7 +6862,7 @@
               <w:bottom w:val="none" w:color="auto" w:sz="0"/>
               <w:right w:val="single" w:color="1F3964" w:sz="8"/>
             </w:tcBorders>
-            <w:shd w:fill="1F3964" w:color="auto" w:val="clear"/>
+            <w:shd w:fill="F5F7FA" w:color="auto" w:val="clear"/>
             <w:tcMar>
               <w:top w:type="dxa" w:w="70"/>
               <w:left w:type="dxa" w:w="180"/>
@@ -10733,7 +6876,7 @@
                 <w:rFonts w:ascii="Calibri" w:cs="Calibri" w:eastAsia="Calibri" w:hAnsi="Calibri"/>
                 <w:b/>
                 <w:bCs/>
-                <w:color w:val="FFC000"/>
+                <w:color w:val="1F3964"/>
                 <w:sz w:val="20"/>
                 <w:szCs w:val="20"/>
               </w:rPr>
@@ -10744,7 +6887,7 @@
                 <w:rFonts w:ascii="Calibri" w:cs="Calibri" w:eastAsia="Calibri" w:hAnsi="Calibri"/>
                 <w:i/>
                 <w:iCs/>
-                <w:color w:val="AABBCC"/>
+                <w:color w:val="8899AA"/>
                 <w:sz w:val="18"/>
                 <w:szCs w:val="18"/>
               </w:rPr>
@@ -11235,7 +7378,7 @@
               <w:bottom w:val="none" w:color="auto" w:sz="0"/>
               <w:right w:val="single" w:color="1F3964" w:sz="8"/>
             </w:tcBorders>
-            <w:shd w:fill="1F3964" w:color="auto" w:val="clear"/>
+            <w:shd w:fill="F5F7FA" w:color="auto" w:val="clear"/>
             <w:tcMar>
               <w:top w:type="dxa" w:w="70"/>
               <w:left w:type="dxa" w:w="180"/>
@@ -11249,7 +7392,7 @@
                 <w:rFonts w:ascii="Calibri" w:cs="Calibri" w:eastAsia="Calibri" w:hAnsi="Calibri"/>
                 <w:b/>
                 <w:bCs/>
-                <w:color w:val="FFC000"/>
+                <w:color w:val="1F3964"/>
                 <w:sz w:val="20"/>
                 <w:szCs w:val="20"/>
               </w:rPr>
@@ -11260,7 +7403,7 @@
                 <w:rFonts w:ascii="Calibri" w:cs="Calibri" w:eastAsia="Calibri" w:hAnsi="Calibri"/>
                 <w:i/>
                 <w:iCs/>
-                <w:color w:val="AABBCC"/>
+                <w:color w:val="8899AA"/>
                 <w:sz w:val="18"/>
                 <w:szCs w:val="18"/>
               </w:rPr>
@@ -11751,7 +7894,7 @@
               <w:bottom w:val="none" w:color="auto" w:sz="0"/>
               <w:right w:val="single" w:color="1F3964" w:sz="8"/>
             </w:tcBorders>
-            <w:shd w:fill="1F3964" w:color="auto" w:val="clear"/>
+            <w:shd w:fill="F5F7FA" w:color="auto" w:val="clear"/>
             <w:tcMar>
               <w:top w:type="dxa" w:w="70"/>
               <w:left w:type="dxa" w:w="180"/>
@@ -11765,7 +7908,7 @@
                 <w:rFonts w:ascii="Calibri" w:cs="Calibri" w:eastAsia="Calibri" w:hAnsi="Calibri"/>
                 <w:b/>
                 <w:bCs/>
-                <w:color w:val="FFC000"/>
+                <w:color w:val="1F3964"/>
                 <w:sz w:val="20"/>
                 <w:szCs w:val="20"/>
               </w:rPr>
@@ -11776,7 +7919,7 @@
                 <w:rFonts w:ascii="Calibri" w:cs="Calibri" w:eastAsia="Calibri" w:hAnsi="Calibri"/>
                 <w:i/>
                 <w:iCs/>
-                <w:color w:val="AABBCC"/>
+                <w:color w:val="8899AA"/>
                 <w:sz w:val="18"/>
                 <w:szCs w:val="18"/>
               </w:rPr>
@@ -12267,7 +8410,7 @@
               <w:bottom w:val="none" w:color="auto" w:sz="0"/>
               <w:right w:val="single" w:color="1F3964" w:sz="8"/>
             </w:tcBorders>
-            <w:shd w:fill="1F3964" w:color="auto" w:val="clear"/>
+            <w:shd w:fill="F5F7FA" w:color="auto" w:val="clear"/>
             <w:tcMar>
               <w:top w:type="dxa" w:w="70"/>
               <w:left w:type="dxa" w:w="180"/>
@@ -12281,7 +8424,7 @@
                 <w:rFonts w:ascii="Calibri" w:cs="Calibri" w:eastAsia="Calibri" w:hAnsi="Calibri"/>
                 <w:b/>
                 <w:bCs/>
-                <w:color w:val="FFC000"/>
+                <w:color w:val="1F3964"/>
                 <w:sz w:val="20"/>
                 <w:szCs w:val="20"/>
               </w:rPr>
@@ -12292,7 +8435,7 @@
                 <w:rFonts w:ascii="Calibri" w:cs="Calibri" w:eastAsia="Calibri" w:hAnsi="Calibri"/>
                 <w:i/>
                 <w:iCs/>
-                <w:color w:val="AABBCC"/>
+                <w:color w:val="8899AA"/>
                 <w:sz w:val="18"/>
                 <w:szCs w:val="18"/>
               </w:rPr>
@@ -12783,7 +8926,7 @@
               <w:bottom w:val="none" w:color="auto" w:sz="0"/>
               <w:right w:val="single" w:color="1F3964" w:sz="8"/>
             </w:tcBorders>
-            <w:shd w:fill="1F3964" w:color="auto" w:val="clear"/>
+            <w:shd w:fill="F5F7FA" w:color="auto" w:val="clear"/>
             <w:tcMar>
               <w:top w:type="dxa" w:w="70"/>
               <w:left w:type="dxa" w:w="180"/>
@@ -12797,7 +8940,7 @@
                 <w:rFonts w:ascii="Calibri" w:cs="Calibri" w:eastAsia="Calibri" w:hAnsi="Calibri"/>
                 <w:b/>
                 <w:bCs/>
-                <w:color w:val="FFC000"/>
+                <w:color w:val="1F3964"/>
                 <w:sz w:val="20"/>
                 <w:szCs w:val="20"/>
               </w:rPr>
@@ -12808,7 +8951,7 @@
                 <w:rFonts w:ascii="Calibri" w:cs="Calibri" w:eastAsia="Calibri" w:hAnsi="Calibri"/>
                 <w:i/>
                 <w:iCs/>
-                <w:color w:val="AABBCC"/>
+                <w:color w:val="8899AA"/>
                 <w:sz w:val="18"/>
                 <w:szCs w:val="18"/>
               </w:rPr>
@@ -13299,7 +9442,7 @@
               <w:bottom w:val="none" w:color="auto" w:sz="0"/>
               <w:right w:val="single" w:color="1F3964" w:sz="8"/>
             </w:tcBorders>
-            <w:shd w:fill="1F3964" w:color="auto" w:val="clear"/>
+            <w:shd w:fill="F5F7FA" w:color="auto" w:val="clear"/>
             <w:tcMar>
               <w:top w:type="dxa" w:w="70"/>
               <w:left w:type="dxa" w:w="180"/>
@@ -13313,7 +9456,7 @@
                 <w:rFonts w:ascii="Calibri" w:cs="Calibri" w:eastAsia="Calibri" w:hAnsi="Calibri"/>
                 <w:b/>
                 <w:bCs/>
-                <w:color w:val="FFC000"/>
+                <w:color w:val="1F3964"/>
                 <w:sz w:val="20"/>
                 <w:szCs w:val="20"/>
               </w:rPr>
@@ -13324,7 +9467,7 @@
                 <w:rFonts w:ascii="Calibri" w:cs="Calibri" w:eastAsia="Calibri" w:hAnsi="Calibri"/>
                 <w:i/>
                 <w:iCs/>
-                <w:color w:val="AABBCC"/>
+                <w:color w:val="8899AA"/>
                 <w:sz w:val="18"/>
                 <w:szCs w:val="18"/>
               </w:rPr>
@@ -13815,7 +9958,7 @@
               <w:bottom w:val="none" w:color="auto" w:sz="0"/>
               <w:right w:val="single" w:color="1F3964" w:sz="8"/>
             </w:tcBorders>
-            <w:shd w:fill="1F3964" w:color="auto" w:val="clear"/>
+            <w:shd w:fill="F5F7FA" w:color="auto" w:val="clear"/>
             <w:tcMar>
               <w:top w:type="dxa" w:w="70"/>
               <w:left w:type="dxa" w:w="180"/>
@@ -13829,7 +9972,7 @@
                 <w:rFonts w:ascii="Calibri" w:cs="Calibri" w:eastAsia="Calibri" w:hAnsi="Calibri"/>
                 <w:b/>
                 <w:bCs/>
-                <w:color w:val="FFC000"/>
+                <w:color w:val="1F3964"/>
                 <w:sz w:val="20"/>
                 <w:szCs w:val="20"/>
               </w:rPr>
@@ -13840,7 +9983,7 @@
                 <w:rFonts w:ascii="Calibri" w:cs="Calibri" w:eastAsia="Calibri" w:hAnsi="Calibri"/>
                 <w:i/>
                 <w:iCs/>
-                <w:color w:val="AABBCC"/>
+                <w:color w:val="8899AA"/>
                 <w:sz w:val="18"/>
                 <w:szCs w:val="18"/>
               </w:rPr>
@@ -14331,7 +10474,7 @@
               <w:bottom w:val="none" w:color="auto" w:sz="0"/>
               <w:right w:val="single" w:color="1F3964" w:sz="8"/>
             </w:tcBorders>
-            <w:shd w:fill="1F3964" w:color="auto" w:val="clear"/>
+            <w:shd w:fill="F5F7FA" w:color="auto" w:val="clear"/>
             <w:tcMar>
               <w:top w:type="dxa" w:w="70"/>
               <w:left w:type="dxa" w:w="180"/>
@@ -14345,7 +10488,7 @@
                 <w:rFonts w:ascii="Calibri" w:cs="Calibri" w:eastAsia="Calibri" w:hAnsi="Calibri"/>
                 <w:b/>
                 <w:bCs/>
-                <w:color w:val="FFC000"/>
+                <w:color w:val="1F3964"/>
                 <w:sz w:val="20"/>
                 <w:szCs w:val="20"/>
               </w:rPr>
@@ -14356,7 +10499,7 @@
                 <w:rFonts w:ascii="Calibri" w:cs="Calibri" w:eastAsia="Calibri" w:hAnsi="Calibri"/>
                 <w:i/>
                 <w:iCs/>
-                <w:color w:val="AABBCC"/>
+                <w:color w:val="8899AA"/>
                 <w:sz w:val="18"/>
                 <w:szCs w:val="18"/>
               </w:rPr>
@@ -14847,7 +10990,7 @@
               <w:bottom w:val="none" w:color="auto" w:sz="0"/>
               <w:right w:val="single" w:color="1F3964" w:sz="8"/>
             </w:tcBorders>
-            <w:shd w:fill="1F3964" w:color="auto" w:val="clear"/>
+            <w:shd w:fill="F5F7FA" w:color="auto" w:val="clear"/>
             <w:tcMar>
               <w:top w:type="dxa" w:w="70"/>
               <w:left w:type="dxa" w:w="180"/>
@@ -14861,7 +11004,7 @@
                 <w:rFonts w:ascii="Calibri" w:cs="Calibri" w:eastAsia="Calibri" w:hAnsi="Calibri"/>
                 <w:b/>
                 <w:bCs/>
-                <w:color w:val="FFC000"/>
+                <w:color w:val="1F3964"/>
                 <w:sz w:val="20"/>
                 <w:szCs w:val="20"/>
               </w:rPr>
@@ -14872,7 +11015,7 @@
                 <w:rFonts w:ascii="Calibri" w:cs="Calibri" w:eastAsia="Calibri" w:hAnsi="Calibri"/>
                 <w:i/>
                 <w:iCs/>
-                <w:color w:val="AABBCC"/>
+                <w:color w:val="8899AA"/>
                 <w:sz w:val="18"/>
                 <w:szCs w:val="18"/>
               </w:rPr>
@@ -15483,7 +11626,7 @@
                 <w:sz w:val="17"/>
                 <w:szCs w:val="17"/>
               </w:rPr>
-              <w:t xml:space="preserve">All active items in one place  ·  Top 3 transfer to Page 3</w:t>
+              <w:t xml:space="preserve">All active items in one place  ·  Top 3 transfer to Page 2</w:t>
             </w:r>
           </w:p>
         </w:tc>
@@ -15512,7 +11655,7 @@
                 <w:sz w:val="20"/>
                 <w:szCs w:val="20"/>
               </w:rPr>
-              <w:t xml:space="preserve">PAGE 4</w:t>
+              <w:t xml:space="preserve">PAGE 3</w:t>
             </w:r>
           </w:p>
           <w:p>
@@ -16536,7 +12679,7 @@
                 <w:sz w:val="17"/>
                 <w:szCs w:val="17"/>
               </w:rPr>
-              <w:t xml:space="preserve">  Write in Section C (Tomorrow's Team Needs to Know) and escalate to Production Manager.  Do not carry quietly past Day 2.</w:t>
+              <w:t xml:space="preserve">  Write in Section C (Page 2 — Team Needs to Know) and escalate to Production Manager.  Do not carry quietly past Day 2.</w:t>
             </w:r>
           </w:p>
         </w:tc>

</xml_diff>